<commit_message>
everything till 6th Oct
</commit_message>
<xml_diff>
--- a/QS WebTech/WebTech Notes.docx
+++ b/QS WebTech/WebTech Notes.docx
@@ -315,23 +315,3233 @@
           <w:szCs w:val="28"/>
         </w:rPr>
       </w:pPr>
-    </w:p>
-    <w:p>
-      <w:pPr>
-        <w:rPr>
+      <w:r>
+        <w:rPr>
+          <w:b/>
+          <w:bCs/>
           <w:sz w:val="28"/>
           <w:szCs w:val="28"/>
         </w:rPr>
-      </w:pPr>
-    </w:p>
-    <w:p>
-      <w:pPr>
-        <w:rPr>
-          <w:sz w:val="24"/>
-          <w:szCs w:val="24"/>
-        </w:rPr>
-      </w:pPr>
-    </w:p>
+        <w:t>SELECTOR:</w:t>
+      </w:r>
+      <w:r>
+        <w:rPr>
+          <w:sz w:val="28"/>
+          <w:szCs w:val="28"/>
+        </w:rPr>
+        <w:t xml:space="preserve"> Selector is a part of CSS tool which is used to select the HTML element on which you want to apply styling.</w:t>
+      </w:r>
+    </w:p>
+    <w:p>
+      <w:pPr>
+        <w:rPr>
+          <w:sz w:val="28"/>
+          <w:szCs w:val="28"/>
+        </w:rPr>
+      </w:pPr>
+      <w:r>
+        <w:rPr>
+          <w:sz w:val="28"/>
+          <w:szCs w:val="28"/>
+        </w:rPr>
+        <w:t>Types of Selectors:</w:t>
+      </w:r>
+    </w:p>
+    <w:p>
+      <w:pPr>
+        <w:pStyle w:val="ListParagraph"/>
+        <w:numPr>
+          <w:ilvl w:val="0"/>
+          <w:numId w:val="2"/>
+        </w:numPr>
+        <w:rPr>
+          <w:sz w:val="28"/>
+          <w:szCs w:val="28"/>
+        </w:rPr>
+      </w:pPr>
+      <w:r>
+        <w:rPr>
+          <w:sz w:val="28"/>
+          <w:szCs w:val="28"/>
+        </w:rPr>
+        <w:t>Simple Selector.</w:t>
+      </w:r>
+    </w:p>
+    <w:p>
+      <w:pPr>
+        <w:pStyle w:val="ListParagraph"/>
+        <w:numPr>
+          <w:ilvl w:val="1"/>
+          <w:numId w:val="2"/>
+        </w:numPr>
+        <w:rPr>
+          <w:sz w:val="28"/>
+          <w:szCs w:val="28"/>
+        </w:rPr>
+      </w:pPr>
+      <w:r>
+        <w:rPr>
+          <w:sz w:val="28"/>
+          <w:szCs w:val="28"/>
+        </w:rPr>
+        <w:t>Tag name.</w:t>
+      </w:r>
+    </w:p>
+    <w:p>
+      <w:pPr>
+        <w:pStyle w:val="ListParagraph"/>
+        <w:numPr>
+          <w:ilvl w:val="1"/>
+          <w:numId w:val="2"/>
+        </w:numPr>
+        <w:rPr>
+          <w:sz w:val="28"/>
+          <w:szCs w:val="28"/>
+        </w:rPr>
+      </w:pPr>
+      <w:r>
+        <w:rPr>
+          <w:sz w:val="28"/>
+          <w:szCs w:val="28"/>
+        </w:rPr>
+        <w:t>Class selector.</w:t>
+      </w:r>
+    </w:p>
+    <w:p>
+      <w:pPr>
+        <w:pStyle w:val="ListParagraph"/>
+        <w:numPr>
+          <w:ilvl w:val="1"/>
+          <w:numId w:val="2"/>
+        </w:numPr>
+        <w:rPr>
+          <w:sz w:val="28"/>
+          <w:szCs w:val="28"/>
+        </w:rPr>
+      </w:pPr>
+      <w:r>
+        <w:rPr>
+          <w:sz w:val="28"/>
+          <w:szCs w:val="28"/>
+        </w:rPr>
+        <w:t>ID selector.</w:t>
+      </w:r>
+    </w:p>
+    <w:p>
+      <w:pPr>
+        <w:pStyle w:val="ListParagraph"/>
+        <w:numPr>
+          <w:ilvl w:val="1"/>
+          <w:numId w:val="2"/>
+        </w:numPr>
+        <w:rPr>
+          <w:sz w:val="28"/>
+          <w:szCs w:val="28"/>
+        </w:rPr>
+      </w:pPr>
+      <w:r>
+        <w:rPr>
+          <w:sz w:val="28"/>
+          <w:szCs w:val="28"/>
+        </w:rPr>
+        <w:t>Universal.</w:t>
+      </w:r>
+    </w:p>
+    <w:p>
+      <w:pPr>
+        <w:pStyle w:val="ListParagraph"/>
+        <w:numPr>
+          <w:ilvl w:val="0"/>
+          <w:numId w:val="2"/>
+        </w:numPr>
+        <w:shd w:val="clear" w:color="auto" w:fill="00002C"/>
+        <w:spacing w:after="0" w:line="285" w:lineRule="atLeast"/>
+        <w:rPr>
+          <w:rFonts w:ascii="Consolas" w:eastAsia="Times New Roman" w:hAnsi="Consolas" w:cs="Times New Roman"/>
+          <w:color w:val="FFFFFF"/>
+          <w:kern w:val="0"/>
+          <w:sz w:val="21"/>
+          <w:szCs w:val="21"/>
+          <w:lang w:eastAsia="en-IN"/>
+          <w14:ligatures w14:val="none"/>
+        </w:rPr>
+      </w:pPr>
+      <w:r>
+        <w:rPr>
+          <w:rFonts w:ascii="Consolas" w:eastAsia="Times New Roman" w:hAnsi="Consolas" w:cs="Times New Roman"/>
+          <w:color w:val="FFFFFF"/>
+          <w:kern w:val="0"/>
+          <w:sz w:val="21"/>
+          <w:szCs w:val="21"/>
+          <w:lang w:eastAsia="en-IN"/>
+          <w14:ligatures w14:val="none"/>
+        </w:rPr>
+        <w:t>&lt;</w:t>
+      </w:r>
+      <w:r>
+        <w:rPr>
+          <w:rFonts w:ascii="Consolas" w:eastAsia="Times New Roman" w:hAnsi="Consolas" w:cs="Times New Roman"/>
+          <w:color w:val="FF0077"/>
+          <w:kern w:val="0"/>
+          <w:sz w:val="21"/>
+          <w:szCs w:val="21"/>
+          <w:lang w:eastAsia="en-IN"/>
+          <w14:ligatures w14:val="none"/>
+        </w:rPr>
+        <w:t>h1</w:t>
+      </w:r>
+      <w:r>
+        <w:rPr>
+          <w:rFonts w:ascii="Consolas" w:eastAsia="Times New Roman" w:hAnsi="Consolas" w:cs="Times New Roman"/>
+          <w:color w:val="FFFFFF"/>
+          <w:kern w:val="0"/>
+          <w:sz w:val="21"/>
+          <w:szCs w:val="21"/>
+          <w:lang w:eastAsia="en-IN"/>
+          <w14:ligatures w14:val="none"/>
+        </w:rPr>
+        <w:t>&gt;Pseudo Class Selectors&lt;/</w:t>
+      </w:r>
+      <w:r>
+        <w:rPr>
+          <w:rFonts w:ascii="Consolas" w:eastAsia="Times New Roman" w:hAnsi="Consolas" w:cs="Times New Roman"/>
+          <w:color w:val="FF0077"/>
+          <w:kern w:val="0"/>
+          <w:sz w:val="21"/>
+          <w:szCs w:val="21"/>
+          <w:lang w:eastAsia="en-IN"/>
+          <w14:ligatures w14:val="none"/>
+        </w:rPr>
+        <w:t>h1</w:t>
+      </w:r>
+      <w:r>
+        <w:rPr>
+          <w:rFonts w:ascii="Consolas" w:eastAsia="Times New Roman" w:hAnsi="Consolas" w:cs="Times New Roman"/>
+          <w:color w:val="FFFFFF"/>
+          <w:kern w:val="0"/>
+          <w:sz w:val="21"/>
+          <w:szCs w:val="21"/>
+          <w:lang w:eastAsia="en-IN"/>
+          <w14:ligatures w14:val="none"/>
+        </w:rPr>
+        <w:t>&gt;</w:t>
+      </w:r>
+    </w:p>
+    <w:p>
+      <w:pPr>
+        <w:pStyle w:val="ListParagraph"/>
+        <w:numPr>
+          <w:ilvl w:val="0"/>
+          <w:numId w:val="2"/>
+        </w:numPr>
+        <w:shd w:val="clear" w:color="auto" w:fill="00002C"/>
+        <w:spacing w:after="0" w:line="285" w:lineRule="atLeast"/>
+        <w:rPr>
+          <w:rFonts w:ascii="Consolas" w:eastAsia="Times New Roman" w:hAnsi="Consolas" w:cs="Times New Roman"/>
+          <w:color w:val="FFFFFF"/>
+          <w:kern w:val="0"/>
+          <w:sz w:val="21"/>
+          <w:szCs w:val="21"/>
+          <w:lang w:eastAsia="en-IN"/>
+          <w14:ligatures w14:val="none"/>
+        </w:rPr>
+      </w:pPr>
+      <w:r>
+        <w:rPr>
+          <w:rFonts w:ascii="Consolas" w:eastAsia="Times New Roman" w:hAnsi="Consolas" w:cs="Times New Roman"/>
+          <w:color w:val="FFFFFF"/>
+          <w:kern w:val="0"/>
+          <w:sz w:val="21"/>
+          <w:szCs w:val="21"/>
+          <w:lang w:eastAsia="en-IN"/>
+          <w14:ligatures w14:val="none"/>
+        </w:rPr>
+        <w:t>    &lt;</w:t>
+      </w:r>
+      <w:r>
+        <w:rPr>
+          <w:rFonts w:ascii="Consolas" w:eastAsia="Times New Roman" w:hAnsi="Consolas" w:cs="Times New Roman"/>
+          <w:color w:val="FF0077"/>
+          <w:kern w:val="0"/>
+          <w:sz w:val="21"/>
+          <w:szCs w:val="21"/>
+          <w:lang w:eastAsia="en-IN"/>
+          <w14:ligatures w14:val="none"/>
+        </w:rPr>
+        <w:t>p</w:t>
+      </w:r>
+      <w:r>
+        <w:rPr>
+          <w:rFonts w:ascii="Consolas" w:eastAsia="Times New Roman" w:hAnsi="Consolas" w:cs="Times New Roman"/>
+          <w:color w:val="FFFFFF"/>
+          <w:kern w:val="0"/>
+          <w:sz w:val="21"/>
+          <w:szCs w:val="21"/>
+          <w:lang w:eastAsia="en-IN"/>
+          <w14:ligatures w14:val="none"/>
+        </w:rPr>
+        <w:t xml:space="preserve">&gt;It is used to select an HTML element based on its state or </w:t>
+      </w:r>
+      <w:proofErr w:type="gramStart"/>
+      <w:r>
+        <w:rPr>
+          <w:rFonts w:ascii="Consolas" w:eastAsia="Times New Roman" w:hAnsi="Consolas" w:cs="Times New Roman"/>
+          <w:color w:val="FFFFFF"/>
+          <w:kern w:val="0"/>
+          <w:sz w:val="21"/>
+          <w:szCs w:val="21"/>
+          <w:lang w:eastAsia="en-IN"/>
+          <w14:ligatures w14:val="none"/>
+        </w:rPr>
+        <w:t>position.&lt;</w:t>
+      </w:r>
+      <w:proofErr w:type="gramEnd"/>
+      <w:r>
+        <w:rPr>
+          <w:rFonts w:ascii="Consolas" w:eastAsia="Times New Roman" w:hAnsi="Consolas" w:cs="Times New Roman"/>
+          <w:color w:val="FFFFFF"/>
+          <w:kern w:val="0"/>
+          <w:sz w:val="21"/>
+          <w:szCs w:val="21"/>
+          <w:lang w:eastAsia="en-IN"/>
+          <w14:ligatures w14:val="none"/>
+        </w:rPr>
+        <w:t>/</w:t>
+      </w:r>
+      <w:r>
+        <w:rPr>
+          <w:rFonts w:ascii="Consolas" w:eastAsia="Times New Roman" w:hAnsi="Consolas" w:cs="Times New Roman"/>
+          <w:color w:val="FF0077"/>
+          <w:kern w:val="0"/>
+          <w:sz w:val="21"/>
+          <w:szCs w:val="21"/>
+          <w:lang w:eastAsia="en-IN"/>
+          <w14:ligatures w14:val="none"/>
+        </w:rPr>
+        <w:t>p</w:t>
+      </w:r>
+      <w:r>
+        <w:rPr>
+          <w:rFonts w:ascii="Consolas" w:eastAsia="Times New Roman" w:hAnsi="Consolas" w:cs="Times New Roman"/>
+          <w:color w:val="FFFFFF"/>
+          <w:kern w:val="0"/>
+          <w:sz w:val="21"/>
+          <w:szCs w:val="21"/>
+          <w:lang w:eastAsia="en-IN"/>
+          <w14:ligatures w14:val="none"/>
+        </w:rPr>
+        <w:t>&gt;</w:t>
+      </w:r>
+    </w:p>
+    <w:p>
+      <w:pPr>
+        <w:pStyle w:val="ListParagraph"/>
+        <w:numPr>
+          <w:ilvl w:val="0"/>
+          <w:numId w:val="2"/>
+        </w:numPr>
+        <w:shd w:val="clear" w:color="auto" w:fill="00002C"/>
+        <w:spacing w:after="0" w:line="285" w:lineRule="atLeast"/>
+        <w:rPr>
+          <w:rFonts w:ascii="Consolas" w:eastAsia="Times New Roman" w:hAnsi="Consolas" w:cs="Times New Roman"/>
+          <w:color w:val="FFFFFF"/>
+          <w:kern w:val="0"/>
+          <w:sz w:val="21"/>
+          <w:szCs w:val="21"/>
+          <w:lang w:eastAsia="en-IN"/>
+          <w14:ligatures w14:val="none"/>
+        </w:rPr>
+      </w:pPr>
+      <w:r>
+        <w:rPr>
+          <w:rFonts w:ascii="Consolas" w:eastAsia="Times New Roman" w:hAnsi="Consolas" w:cs="Times New Roman"/>
+          <w:color w:val="FFFFFF"/>
+          <w:kern w:val="0"/>
+          <w:sz w:val="21"/>
+          <w:szCs w:val="21"/>
+          <w:lang w:eastAsia="en-IN"/>
+          <w14:ligatures w14:val="none"/>
+        </w:rPr>
+        <w:t>    &lt;</w:t>
+      </w:r>
+      <w:proofErr w:type="spellStart"/>
+      <w:r>
+        <w:rPr>
+          <w:rFonts w:ascii="Consolas" w:eastAsia="Times New Roman" w:hAnsi="Consolas" w:cs="Times New Roman"/>
+          <w:color w:val="FF0077"/>
+          <w:kern w:val="0"/>
+          <w:sz w:val="21"/>
+          <w:szCs w:val="21"/>
+          <w:lang w:eastAsia="en-IN"/>
+          <w14:ligatures w14:val="none"/>
+        </w:rPr>
+        <w:t>ol</w:t>
+      </w:r>
+      <w:proofErr w:type="spellEnd"/>
+      <w:r>
+        <w:rPr>
+          <w:rFonts w:ascii="Consolas" w:eastAsia="Times New Roman" w:hAnsi="Consolas" w:cs="Times New Roman"/>
+          <w:color w:val="FFFFFF"/>
+          <w:kern w:val="0"/>
+          <w:sz w:val="21"/>
+          <w:szCs w:val="21"/>
+          <w:lang w:eastAsia="en-IN"/>
+          <w14:ligatures w14:val="none"/>
+        </w:rPr>
+        <w:t>&gt;</w:t>
+      </w:r>
+    </w:p>
+    <w:p>
+      <w:pPr>
+        <w:pStyle w:val="ListParagraph"/>
+        <w:numPr>
+          <w:ilvl w:val="0"/>
+          <w:numId w:val="2"/>
+        </w:numPr>
+        <w:shd w:val="clear" w:color="auto" w:fill="00002C"/>
+        <w:spacing w:after="0" w:line="285" w:lineRule="atLeast"/>
+        <w:rPr>
+          <w:rFonts w:ascii="Consolas" w:eastAsia="Times New Roman" w:hAnsi="Consolas" w:cs="Times New Roman"/>
+          <w:color w:val="FFFFFF"/>
+          <w:kern w:val="0"/>
+          <w:sz w:val="21"/>
+          <w:szCs w:val="21"/>
+          <w:lang w:eastAsia="en-IN"/>
+          <w14:ligatures w14:val="none"/>
+        </w:rPr>
+      </w:pPr>
+      <w:r>
+        <w:rPr>
+          <w:rFonts w:ascii="Consolas" w:eastAsia="Times New Roman" w:hAnsi="Consolas" w:cs="Times New Roman"/>
+          <w:color w:val="FFFFFF"/>
+          <w:kern w:val="0"/>
+          <w:sz w:val="21"/>
+          <w:szCs w:val="21"/>
+          <w:lang w:eastAsia="en-IN"/>
+          <w14:ligatures w14:val="none"/>
+        </w:rPr>
+        <w:t>        &lt;</w:t>
+      </w:r>
+      <w:r>
+        <w:rPr>
+          <w:rFonts w:ascii="Consolas" w:eastAsia="Times New Roman" w:hAnsi="Consolas" w:cs="Times New Roman"/>
+          <w:color w:val="FF0077"/>
+          <w:kern w:val="0"/>
+          <w:sz w:val="21"/>
+          <w:szCs w:val="21"/>
+          <w:lang w:eastAsia="en-IN"/>
+          <w14:ligatures w14:val="none"/>
+        </w:rPr>
+        <w:t>li</w:t>
+      </w:r>
+      <w:r>
+        <w:rPr>
+          <w:rFonts w:ascii="Consolas" w:eastAsia="Times New Roman" w:hAnsi="Consolas" w:cs="Times New Roman"/>
+          <w:color w:val="FFFFFF"/>
+          <w:kern w:val="0"/>
+          <w:sz w:val="21"/>
+          <w:szCs w:val="21"/>
+          <w:lang w:eastAsia="en-IN"/>
+          <w14:ligatures w14:val="none"/>
+        </w:rPr>
+        <w:t>&gt;Hover&lt;/</w:t>
+      </w:r>
+      <w:r>
+        <w:rPr>
+          <w:rFonts w:ascii="Consolas" w:eastAsia="Times New Roman" w:hAnsi="Consolas" w:cs="Times New Roman"/>
+          <w:color w:val="FF0077"/>
+          <w:kern w:val="0"/>
+          <w:sz w:val="21"/>
+          <w:szCs w:val="21"/>
+          <w:lang w:eastAsia="en-IN"/>
+          <w14:ligatures w14:val="none"/>
+        </w:rPr>
+        <w:t>li</w:t>
+      </w:r>
+      <w:r>
+        <w:rPr>
+          <w:rFonts w:ascii="Consolas" w:eastAsia="Times New Roman" w:hAnsi="Consolas" w:cs="Times New Roman"/>
+          <w:color w:val="FFFFFF"/>
+          <w:kern w:val="0"/>
+          <w:sz w:val="21"/>
+          <w:szCs w:val="21"/>
+          <w:lang w:eastAsia="en-IN"/>
+          <w14:ligatures w14:val="none"/>
+        </w:rPr>
+        <w:t>&gt;</w:t>
+      </w:r>
+    </w:p>
+    <w:p>
+      <w:pPr>
+        <w:pStyle w:val="ListParagraph"/>
+        <w:numPr>
+          <w:ilvl w:val="0"/>
+          <w:numId w:val="2"/>
+        </w:numPr>
+        <w:shd w:val="clear" w:color="auto" w:fill="00002C"/>
+        <w:spacing w:after="0" w:line="285" w:lineRule="atLeast"/>
+        <w:rPr>
+          <w:rFonts w:ascii="Consolas" w:eastAsia="Times New Roman" w:hAnsi="Consolas" w:cs="Times New Roman"/>
+          <w:color w:val="FFFFFF"/>
+          <w:kern w:val="0"/>
+          <w:sz w:val="21"/>
+          <w:szCs w:val="21"/>
+          <w:lang w:eastAsia="en-IN"/>
+          <w14:ligatures w14:val="none"/>
+        </w:rPr>
+      </w:pPr>
+      <w:r>
+        <w:rPr>
+          <w:rFonts w:ascii="Consolas" w:eastAsia="Times New Roman" w:hAnsi="Consolas" w:cs="Times New Roman"/>
+          <w:color w:val="FFFFFF"/>
+          <w:kern w:val="0"/>
+          <w:sz w:val="21"/>
+          <w:szCs w:val="21"/>
+          <w:lang w:eastAsia="en-IN"/>
+          <w14:ligatures w14:val="none"/>
+        </w:rPr>
+        <w:t>        &lt;</w:t>
+      </w:r>
+      <w:r>
+        <w:rPr>
+          <w:rFonts w:ascii="Consolas" w:eastAsia="Times New Roman" w:hAnsi="Consolas" w:cs="Times New Roman"/>
+          <w:color w:val="FF0077"/>
+          <w:kern w:val="0"/>
+          <w:sz w:val="21"/>
+          <w:szCs w:val="21"/>
+          <w:lang w:eastAsia="en-IN"/>
+          <w14:ligatures w14:val="none"/>
+        </w:rPr>
+        <w:t>li</w:t>
+      </w:r>
+      <w:r>
+        <w:rPr>
+          <w:rFonts w:ascii="Consolas" w:eastAsia="Times New Roman" w:hAnsi="Consolas" w:cs="Times New Roman"/>
+          <w:color w:val="FFFFFF"/>
+          <w:kern w:val="0"/>
+          <w:sz w:val="21"/>
+          <w:szCs w:val="21"/>
+          <w:lang w:eastAsia="en-IN"/>
+          <w14:ligatures w14:val="none"/>
+        </w:rPr>
+        <w:t>&gt;before&lt;/</w:t>
+      </w:r>
+      <w:r>
+        <w:rPr>
+          <w:rFonts w:ascii="Consolas" w:eastAsia="Times New Roman" w:hAnsi="Consolas" w:cs="Times New Roman"/>
+          <w:color w:val="FF0077"/>
+          <w:kern w:val="0"/>
+          <w:sz w:val="21"/>
+          <w:szCs w:val="21"/>
+          <w:lang w:eastAsia="en-IN"/>
+          <w14:ligatures w14:val="none"/>
+        </w:rPr>
+        <w:t>li</w:t>
+      </w:r>
+      <w:r>
+        <w:rPr>
+          <w:rFonts w:ascii="Consolas" w:eastAsia="Times New Roman" w:hAnsi="Consolas" w:cs="Times New Roman"/>
+          <w:color w:val="FFFFFF"/>
+          <w:kern w:val="0"/>
+          <w:sz w:val="21"/>
+          <w:szCs w:val="21"/>
+          <w:lang w:eastAsia="en-IN"/>
+          <w14:ligatures w14:val="none"/>
+        </w:rPr>
+        <w:t>&gt;</w:t>
+      </w:r>
+    </w:p>
+    <w:p>
+      <w:pPr>
+        <w:pStyle w:val="ListParagraph"/>
+        <w:numPr>
+          <w:ilvl w:val="0"/>
+          <w:numId w:val="2"/>
+        </w:numPr>
+        <w:shd w:val="clear" w:color="auto" w:fill="00002C"/>
+        <w:spacing w:after="0" w:line="285" w:lineRule="atLeast"/>
+        <w:rPr>
+          <w:rFonts w:ascii="Consolas" w:eastAsia="Times New Roman" w:hAnsi="Consolas" w:cs="Times New Roman"/>
+          <w:color w:val="FFFFFF"/>
+          <w:kern w:val="0"/>
+          <w:sz w:val="21"/>
+          <w:szCs w:val="21"/>
+          <w:lang w:eastAsia="en-IN"/>
+          <w14:ligatures w14:val="none"/>
+        </w:rPr>
+      </w:pPr>
+      <w:r>
+        <w:rPr>
+          <w:rFonts w:ascii="Consolas" w:eastAsia="Times New Roman" w:hAnsi="Consolas" w:cs="Times New Roman"/>
+          <w:color w:val="FFFFFF"/>
+          <w:kern w:val="0"/>
+          <w:sz w:val="21"/>
+          <w:szCs w:val="21"/>
+          <w:lang w:eastAsia="en-IN"/>
+          <w14:ligatures w14:val="none"/>
+        </w:rPr>
+        <w:t>        &lt;</w:t>
+      </w:r>
+      <w:r>
+        <w:rPr>
+          <w:rFonts w:ascii="Consolas" w:eastAsia="Times New Roman" w:hAnsi="Consolas" w:cs="Times New Roman"/>
+          <w:color w:val="FF0077"/>
+          <w:kern w:val="0"/>
+          <w:sz w:val="21"/>
+          <w:szCs w:val="21"/>
+          <w:lang w:eastAsia="en-IN"/>
+          <w14:ligatures w14:val="none"/>
+        </w:rPr>
+        <w:t>li</w:t>
+      </w:r>
+      <w:r>
+        <w:rPr>
+          <w:rFonts w:ascii="Consolas" w:eastAsia="Times New Roman" w:hAnsi="Consolas" w:cs="Times New Roman"/>
+          <w:color w:val="FFFFFF"/>
+          <w:kern w:val="0"/>
+          <w:sz w:val="21"/>
+          <w:szCs w:val="21"/>
+          <w:lang w:eastAsia="en-IN"/>
+          <w14:ligatures w14:val="none"/>
+        </w:rPr>
+        <w:t>&gt;after&lt;/</w:t>
+      </w:r>
+      <w:r>
+        <w:rPr>
+          <w:rFonts w:ascii="Consolas" w:eastAsia="Times New Roman" w:hAnsi="Consolas" w:cs="Times New Roman"/>
+          <w:color w:val="FF0077"/>
+          <w:kern w:val="0"/>
+          <w:sz w:val="21"/>
+          <w:szCs w:val="21"/>
+          <w:lang w:eastAsia="en-IN"/>
+          <w14:ligatures w14:val="none"/>
+        </w:rPr>
+        <w:t>li</w:t>
+      </w:r>
+      <w:r>
+        <w:rPr>
+          <w:rFonts w:ascii="Consolas" w:eastAsia="Times New Roman" w:hAnsi="Consolas" w:cs="Times New Roman"/>
+          <w:color w:val="FFFFFF"/>
+          <w:kern w:val="0"/>
+          <w:sz w:val="21"/>
+          <w:szCs w:val="21"/>
+          <w:lang w:eastAsia="en-IN"/>
+          <w14:ligatures w14:val="none"/>
+        </w:rPr>
+        <w:t>&gt;</w:t>
+      </w:r>
+    </w:p>
+    <w:p>
+      <w:pPr>
+        <w:pStyle w:val="ListParagraph"/>
+        <w:numPr>
+          <w:ilvl w:val="0"/>
+          <w:numId w:val="2"/>
+        </w:numPr>
+        <w:shd w:val="clear" w:color="auto" w:fill="00002C"/>
+        <w:spacing w:after="0" w:line="285" w:lineRule="atLeast"/>
+        <w:rPr>
+          <w:rFonts w:ascii="Consolas" w:eastAsia="Times New Roman" w:hAnsi="Consolas" w:cs="Times New Roman"/>
+          <w:color w:val="FFFFFF"/>
+          <w:kern w:val="0"/>
+          <w:sz w:val="21"/>
+          <w:szCs w:val="21"/>
+          <w:lang w:eastAsia="en-IN"/>
+          <w14:ligatures w14:val="none"/>
+        </w:rPr>
+      </w:pPr>
+      <w:r>
+        <w:rPr>
+          <w:rFonts w:ascii="Consolas" w:eastAsia="Times New Roman" w:hAnsi="Consolas" w:cs="Times New Roman"/>
+          <w:color w:val="FFFFFF"/>
+          <w:kern w:val="0"/>
+          <w:sz w:val="21"/>
+          <w:szCs w:val="21"/>
+          <w:lang w:eastAsia="en-IN"/>
+          <w14:ligatures w14:val="none"/>
+        </w:rPr>
+        <w:t>        &lt;</w:t>
+      </w:r>
+      <w:r>
+        <w:rPr>
+          <w:rFonts w:ascii="Consolas" w:eastAsia="Times New Roman" w:hAnsi="Consolas" w:cs="Times New Roman"/>
+          <w:color w:val="FF0077"/>
+          <w:kern w:val="0"/>
+          <w:sz w:val="21"/>
+          <w:szCs w:val="21"/>
+          <w:lang w:eastAsia="en-IN"/>
+          <w14:ligatures w14:val="none"/>
+        </w:rPr>
+        <w:t>li</w:t>
+      </w:r>
+      <w:r>
+        <w:rPr>
+          <w:rFonts w:ascii="Consolas" w:eastAsia="Times New Roman" w:hAnsi="Consolas" w:cs="Times New Roman"/>
+          <w:color w:val="FFFFFF"/>
+          <w:kern w:val="0"/>
+          <w:sz w:val="21"/>
+          <w:szCs w:val="21"/>
+          <w:lang w:eastAsia="en-IN"/>
+          <w14:ligatures w14:val="none"/>
+        </w:rPr>
+        <w:t>&gt;Active&lt;/</w:t>
+      </w:r>
+      <w:r>
+        <w:rPr>
+          <w:rFonts w:ascii="Consolas" w:eastAsia="Times New Roman" w:hAnsi="Consolas" w:cs="Times New Roman"/>
+          <w:color w:val="FF0077"/>
+          <w:kern w:val="0"/>
+          <w:sz w:val="21"/>
+          <w:szCs w:val="21"/>
+          <w:lang w:eastAsia="en-IN"/>
+          <w14:ligatures w14:val="none"/>
+        </w:rPr>
+        <w:t>li</w:t>
+      </w:r>
+      <w:r>
+        <w:rPr>
+          <w:rFonts w:ascii="Consolas" w:eastAsia="Times New Roman" w:hAnsi="Consolas" w:cs="Times New Roman"/>
+          <w:color w:val="FFFFFF"/>
+          <w:kern w:val="0"/>
+          <w:sz w:val="21"/>
+          <w:szCs w:val="21"/>
+          <w:lang w:eastAsia="en-IN"/>
+          <w14:ligatures w14:val="none"/>
+        </w:rPr>
+        <w:t>&gt;</w:t>
+      </w:r>
+    </w:p>
+    <w:p>
+      <w:pPr>
+        <w:pStyle w:val="ListParagraph"/>
+        <w:numPr>
+          <w:ilvl w:val="0"/>
+          <w:numId w:val="2"/>
+        </w:numPr>
+        <w:shd w:val="clear" w:color="auto" w:fill="00002C"/>
+        <w:spacing w:after="0" w:line="285" w:lineRule="atLeast"/>
+        <w:rPr>
+          <w:rFonts w:ascii="Consolas" w:eastAsia="Times New Roman" w:hAnsi="Consolas" w:cs="Times New Roman"/>
+          <w:color w:val="FFFFFF"/>
+          <w:kern w:val="0"/>
+          <w:sz w:val="21"/>
+          <w:szCs w:val="21"/>
+          <w:lang w:eastAsia="en-IN"/>
+          <w14:ligatures w14:val="none"/>
+        </w:rPr>
+      </w:pPr>
+      <w:r>
+        <w:rPr>
+          <w:rFonts w:ascii="Consolas" w:eastAsia="Times New Roman" w:hAnsi="Consolas" w:cs="Times New Roman"/>
+          <w:color w:val="FFFFFF"/>
+          <w:kern w:val="0"/>
+          <w:sz w:val="21"/>
+          <w:szCs w:val="21"/>
+          <w:lang w:eastAsia="en-IN"/>
+          <w14:ligatures w14:val="none"/>
+        </w:rPr>
+        <w:t>        &lt;</w:t>
+      </w:r>
+      <w:r>
+        <w:rPr>
+          <w:rFonts w:ascii="Consolas" w:eastAsia="Times New Roman" w:hAnsi="Consolas" w:cs="Times New Roman"/>
+          <w:color w:val="FF0077"/>
+          <w:kern w:val="0"/>
+          <w:sz w:val="21"/>
+          <w:szCs w:val="21"/>
+          <w:lang w:eastAsia="en-IN"/>
+          <w14:ligatures w14:val="none"/>
+        </w:rPr>
+        <w:t>li</w:t>
+      </w:r>
+      <w:r>
+        <w:rPr>
+          <w:rFonts w:ascii="Consolas" w:eastAsia="Times New Roman" w:hAnsi="Consolas" w:cs="Times New Roman"/>
+          <w:color w:val="FFFFFF"/>
+          <w:kern w:val="0"/>
+          <w:sz w:val="21"/>
+          <w:szCs w:val="21"/>
+          <w:lang w:eastAsia="en-IN"/>
+          <w14:ligatures w14:val="none"/>
+        </w:rPr>
+        <w:t>&gt;Focus&lt;/</w:t>
+      </w:r>
+      <w:r>
+        <w:rPr>
+          <w:rFonts w:ascii="Consolas" w:eastAsia="Times New Roman" w:hAnsi="Consolas" w:cs="Times New Roman"/>
+          <w:color w:val="FF0077"/>
+          <w:kern w:val="0"/>
+          <w:sz w:val="21"/>
+          <w:szCs w:val="21"/>
+          <w:lang w:eastAsia="en-IN"/>
+          <w14:ligatures w14:val="none"/>
+        </w:rPr>
+        <w:t>li</w:t>
+      </w:r>
+      <w:r>
+        <w:rPr>
+          <w:rFonts w:ascii="Consolas" w:eastAsia="Times New Roman" w:hAnsi="Consolas" w:cs="Times New Roman"/>
+          <w:color w:val="FFFFFF"/>
+          <w:kern w:val="0"/>
+          <w:sz w:val="21"/>
+          <w:szCs w:val="21"/>
+          <w:lang w:eastAsia="en-IN"/>
+          <w14:ligatures w14:val="none"/>
+        </w:rPr>
+        <w:t>&gt;</w:t>
+      </w:r>
+    </w:p>
+    <w:p>
+      <w:pPr>
+        <w:pStyle w:val="ListParagraph"/>
+        <w:numPr>
+          <w:ilvl w:val="0"/>
+          <w:numId w:val="2"/>
+        </w:numPr>
+        <w:shd w:val="clear" w:color="auto" w:fill="00002C"/>
+        <w:spacing w:after="0" w:line="285" w:lineRule="atLeast"/>
+        <w:rPr>
+          <w:rFonts w:ascii="Consolas" w:eastAsia="Times New Roman" w:hAnsi="Consolas" w:cs="Times New Roman"/>
+          <w:color w:val="FFFFFF"/>
+          <w:kern w:val="0"/>
+          <w:sz w:val="21"/>
+          <w:szCs w:val="21"/>
+          <w:lang w:eastAsia="en-IN"/>
+          <w14:ligatures w14:val="none"/>
+        </w:rPr>
+      </w:pPr>
+      <w:r>
+        <w:rPr>
+          <w:rFonts w:ascii="Consolas" w:eastAsia="Times New Roman" w:hAnsi="Consolas" w:cs="Times New Roman"/>
+          <w:color w:val="FFFFFF"/>
+          <w:kern w:val="0"/>
+          <w:sz w:val="21"/>
+          <w:szCs w:val="21"/>
+          <w:lang w:eastAsia="en-IN"/>
+          <w14:ligatures w14:val="none"/>
+        </w:rPr>
+        <w:t>        &lt;</w:t>
+      </w:r>
+      <w:r>
+        <w:rPr>
+          <w:rFonts w:ascii="Consolas" w:eastAsia="Times New Roman" w:hAnsi="Consolas" w:cs="Times New Roman"/>
+          <w:color w:val="FF0077"/>
+          <w:kern w:val="0"/>
+          <w:sz w:val="21"/>
+          <w:szCs w:val="21"/>
+          <w:lang w:eastAsia="en-IN"/>
+          <w14:ligatures w14:val="none"/>
+        </w:rPr>
+        <w:t>li</w:t>
+      </w:r>
+      <w:r>
+        <w:rPr>
+          <w:rFonts w:ascii="Consolas" w:eastAsia="Times New Roman" w:hAnsi="Consolas" w:cs="Times New Roman"/>
+          <w:color w:val="FFFFFF"/>
+          <w:kern w:val="0"/>
+          <w:sz w:val="21"/>
+          <w:szCs w:val="21"/>
+          <w:lang w:eastAsia="en-IN"/>
+          <w14:ligatures w14:val="none"/>
+        </w:rPr>
+        <w:t>&gt;Visited&lt;/</w:t>
+      </w:r>
+      <w:r>
+        <w:rPr>
+          <w:rFonts w:ascii="Consolas" w:eastAsia="Times New Roman" w:hAnsi="Consolas" w:cs="Times New Roman"/>
+          <w:color w:val="FF0077"/>
+          <w:kern w:val="0"/>
+          <w:sz w:val="21"/>
+          <w:szCs w:val="21"/>
+          <w:lang w:eastAsia="en-IN"/>
+          <w14:ligatures w14:val="none"/>
+        </w:rPr>
+        <w:t>li</w:t>
+      </w:r>
+      <w:r>
+        <w:rPr>
+          <w:rFonts w:ascii="Consolas" w:eastAsia="Times New Roman" w:hAnsi="Consolas" w:cs="Times New Roman"/>
+          <w:color w:val="FFFFFF"/>
+          <w:kern w:val="0"/>
+          <w:sz w:val="21"/>
+          <w:szCs w:val="21"/>
+          <w:lang w:eastAsia="en-IN"/>
+          <w14:ligatures w14:val="none"/>
+        </w:rPr>
+        <w:t>&gt;</w:t>
+      </w:r>
+    </w:p>
+    <w:p>
+      <w:pPr>
+        <w:pStyle w:val="ListParagraph"/>
+        <w:numPr>
+          <w:ilvl w:val="0"/>
+          <w:numId w:val="2"/>
+        </w:numPr>
+        <w:shd w:val="clear" w:color="auto" w:fill="00002C"/>
+        <w:spacing w:after="0" w:line="285" w:lineRule="atLeast"/>
+        <w:rPr>
+          <w:rFonts w:ascii="Consolas" w:eastAsia="Times New Roman" w:hAnsi="Consolas" w:cs="Times New Roman"/>
+          <w:color w:val="FFFFFF"/>
+          <w:kern w:val="0"/>
+          <w:sz w:val="21"/>
+          <w:szCs w:val="21"/>
+          <w:lang w:eastAsia="en-IN"/>
+          <w14:ligatures w14:val="none"/>
+        </w:rPr>
+      </w:pPr>
+      <w:r>
+        <w:rPr>
+          <w:rFonts w:ascii="Consolas" w:eastAsia="Times New Roman" w:hAnsi="Consolas" w:cs="Times New Roman"/>
+          <w:color w:val="FFFFFF"/>
+          <w:kern w:val="0"/>
+          <w:sz w:val="21"/>
+          <w:szCs w:val="21"/>
+          <w:lang w:eastAsia="en-IN"/>
+          <w14:ligatures w14:val="none"/>
+        </w:rPr>
+        <w:lastRenderedPageBreak/>
+        <w:t>        &lt;</w:t>
+      </w:r>
+      <w:r>
+        <w:rPr>
+          <w:rFonts w:ascii="Consolas" w:eastAsia="Times New Roman" w:hAnsi="Consolas" w:cs="Times New Roman"/>
+          <w:color w:val="FF0077"/>
+          <w:kern w:val="0"/>
+          <w:sz w:val="21"/>
+          <w:szCs w:val="21"/>
+          <w:lang w:eastAsia="en-IN"/>
+          <w14:ligatures w14:val="none"/>
+        </w:rPr>
+        <w:t>li</w:t>
+      </w:r>
+      <w:r>
+        <w:rPr>
+          <w:rFonts w:ascii="Consolas" w:eastAsia="Times New Roman" w:hAnsi="Consolas" w:cs="Times New Roman"/>
+          <w:color w:val="FFFFFF"/>
+          <w:kern w:val="0"/>
+          <w:sz w:val="21"/>
+          <w:szCs w:val="21"/>
+          <w:lang w:eastAsia="en-IN"/>
+          <w14:ligatures w14:val="none"/>
+        </w:rPr>
+        <w:t>&gt;</w:t>
+      </w:r>
+      <w:proofErr w:type="gramStart"/>
+      <w:r>
+        <w:rPr>
+          <w:rFonts w:ascii="Consolas" w:eastAsia="Times New Roman" w:hAnsi="Consolas" w:cs="Times New Roman"/>
+          <w:color w:val="FFFFFF"/>
+          <w:kern w:val="0"/>
+          <w:sz w:val="21"/>
+          <w:szCs w:val="21"/>
+          <w:lang w:eastAsia="en-IN"/>
+          <w14:ligatures w14:val="none"/>
+        </w:rPr>
+        <w:t>First-child</w:t>
+      </w:r>
+      <w:proofErr w:type="gramEnd"/>
+      <w:r>
+        <w:rPr>
+          <w:rFonts w:ascii="Consolas" w:eastAsia="Times New Roman" w:hAnsi="Consolas" w:cs="Times New Roman"/>
+          <w:color w:val="FFFFFF"/>
+          <w:kern w:val="0"/>
+          <w:sz w:val="21"/>
+          <w:szCs w:val="21"/>
+          <w:lang w:eastAsia="en-IN"/>
+          <w14:ligatures w14:val="none"/>
+        </w:rPr>
+        <w:t>&lt;/</w:t>
+      </w:r>
+      <w:r>
+        <w:rPr>
+          <w:rFonts w:ascii="Consolas" w:eastAsia="Times New Roman" w:hAnsi="Consolas" w:cs="Times New Roman"/>
+          <w:color w:val="FF0077"/>
+          <w:kern w:val="0"/>
+          <w:sz w:val="21"/>
+          <w:szCs w:val="21"/>
+          <w:lang w:eastAsia="en-IN"/>
+          <w14:ligatures w14:val="none"/>
+        </w:rPr>
+        <w:t>li</w:t>
+      </w:r>
+      <w:r>
+        <w:rPr>
+          <w:rFonts w:ascii="Consolas" w:eastAsia="Times New Roman" w:hAnsi="Consolas" w:cs="Times New Roman"/>
+          <w:color w:val="FFFFFF"/>
+          <w:kern w:val="0"/>
+          <w:sz w:val="21"/>
+          <w:szCs w:val="21"/>
+          <w:lang w:eastAsia="en-IN"/>
+          <w14:ligatures w14:val="none"/>
+        </w:rPr>
+        <w:t>&gt;</w:t>
+      </w:r>
+    </w:p>
+    <w:p>
+      <w:pPr>
+        <w:pStyle w:val="ListParagraph"/>
+        <w:numPr>
+          <w:ilvl w:val="0"/>
+          <w:numId w:val="2"/>
+        </w:numPr>
+        <w:shd w:val="clear" w:color="auto" w:fill="00002C"/>
+        <w:spacing w:after="0" w:line="285" w:lineRule="atLeast"/>
+        <w:rPr>
+          <w:rFonts w:ascii="Consolas" w:eastAsia="Times New Roman" w:hAnsi="Consolas" w:cs="Times New Roman"/>
+          <w:color w:val="FFFFFF"/>
+          <w:kern w:val="0"/>
+          <w:sz w:val="21"/>
+          <w:szCs w:val="21"/>
+          <w:lang w:eastAsia="en-IN"/>
+          <w14:ligatures w14:val="none"/>
+        </w:rPr>
+      </w:pPr>
+      <w:r>
+        <w:rPr>
+          <w:rFonts w:ascii="Consolas" w:eastAsia="Times New Roman" w:hAnsi="Consolas" w:cs="Times New Roman"/>
+          <w:color w:val="FFFFFF"/>
+          <w:kern w:val="0"/>
+          <w:sz w:val="21"/>
+          <w:szCs w:val="21"/>
+          <w:lang w:eastAsia="en-IN"/>
+          <w14:ligatures w14:val="none"/>
+        </w:rPr>
+        <w:t>        &lt;</w:t>
+      </w:r>
+      <w:r>
+        <w:rPr>
+          <w:rFonts w:ascii="Consolas" w:eastAsia="Times New Roman" w:hAnsi="Consolas" w:cs="Times New Roman"/>
+          <w:color w:val="FF0077"/>
+          <w:kern w:val="0"/>
+          <w:sz w:val="21"/>
+          <w:szCs w:val="21"/>
+          <w:lang w:eastAsia="en-IN"/>
+          <w14:ligatures w14:val="none"/>
+        </w:rPr>
+        <w:t>li</w:t>
+      </w:r>
+      <w:r>
+        <w:rPr>
+          <w:rFonts w:ascii="Consolas" w:eastAsia="Times New Roman" w:hAnsi="Consolas" w:cs="Times New Roman"/>
+          <w:color w:val="FFFFFF"/>
+          <w:kern w:val="0"/>
+          <w:sz w:val="21"/>
+          <w:szCs w:val="21"/>
+          <w:lang w:eastAsia="en-IN"/>
+          <w14:ligatures w14:val="none"/>
+        </w:rPr>
+        <w:t>&gt;</w:t>
+      </w:r>
+      <w:proofErr w:type="gramStart"/>
+      <w:r>
+        <w:rPr>
+          <w:rFonts w:ascii="Consolas" w:eastAsia="Times New Roman" w:hAnsi="Consolas" w:cs="Times New Roman"/>
+          <w:color w:val="FFFFFF"/>
+          <w:kern w:val="0"/>
+          <w:sz w:val="21"/>
+          <w:szCs w:val="21"/>
+          <w:lang w:eastAsia="en-IN"/>
+          <w14:ligatures w14:val="none"/>
+        </w:rPr>
+        <w:t>Last-child</w:t>
+      </w:r>
+      <w:proofErr w:type="gramEnd"/>
+      <w:r>
+        <w:rPr>
+          <w:rFonts w:ascii="Consolas" w:eastAsia="Times New Roman" w:hAnsi="Consolas" w:cs="Times New Roman"/>
+          <w:color w:val="FFFFFF"/>
+          <w:kern w:val="0"/>
+          <w:sz w:val="21"/>
+          <w:szCs w:val="21"/>
+          <w:lang w:eastAsia="en-IN"/>
+          <w14:ligatures w14:val="none"/>
+        </w:rPr>
+        <w:t>&lt;/</w:t>
+      </w:r>
+      <w:r>
+        <w:rPr>
+          <w:rFonts w:ascii="Consolas" w:eastAsia="Times New Roman" w:hAnsi="Consolas" w:cs="Times New Roman"/>
+          <w:color w:val="FF0077"/>
+          <w:kern w:val="0"/>
+          <w:sz w:val="21"/>
+          <w:szCs w:val="21"/>
+          <w:lang w:eastAsia="en-IN"/>
+          <w14:ligatures w14:val="none"/>
+        </w:rPr>
+        <w:t>li</w:t>
+      </w:r>
+      <w:r>
+        <w:rPr>
+          <w:rFonts w:ascii="Consolas" w:eastAsia="Times New Roman" w:hAnsi="Consolas" w:cs="Times New Roman"/>
+          <w:color w:val="FFFFFF"/>
+          <w:kern w:val="0"/>
+          <w:sz w:val="21"/>
+          <w:szCs w:val="21"/>
+          <w:lang w:eastAsia="en-IN"/>
+          <w14:ligatures w14:val="none"/>
+        </w:rPr>
+        <w:t>&gt;</w:t>
+      </w:r>
+    </w:p>
+    <w:p>
+      <w:pPr>
+        <w:pStyle w:val="ListParagraph"/>
+        <w:numPr>
+          <w:ilvl w:val="0"/>
+          <w:numId w:val="2"/>
+        </w:numPr>
+        <w:shd w:val="clear" w:color="auto" w:fill="00002C"/>
+        <w:spacing w:after="0" w:line="285" w:lineRule="atLeast"/>
+        <w:rPr>
+          <w:rFonts w:ascii="Consolas" w:eastAsia="Times New Roman" w:hAnsi="Consolas" w:cs="Times New Roman"/>
+          <w:color w:val="FFFFFF"/>
+          <w:kern w:val="0"/>
+          <w:sz w:val="21"/>
+          <w:szCs w:val="21"/>
+          <w:lang w:eastAsia="en-IN"/>
+          <w14:ligatures w14:val="none"/>
+        </w:rPr>
+      </w:pPr>
+      <w:r>
+        <w:rPr>
+          <w:rFonts w:ascii="Consolas" w:eastAsia="Times New Roman" w:hAnsi="Consolas" w:cs="Times New Roman"/>
+          <w:color w:val="FFFFFF"/>
+          <w:kern w:val="0"/>
+          <w:sz w:val="21"/>
+          <w:szCs w:val="21"/>
+          <w:lang w:eastAsia="en-IN"/>
+          <w14:ligatures w14:val="none"/>
+        </w:rPr>
+        <w:t>        &lt;</w:t>
+      </w:r>
+      <w:r>
+        <w:rPr>
+          <w:rFonts w:ascii="Consolas" w:eastAsia="Times New Roman" w:hAnsi="Consolas" w:cs="Times New Roman"/>
+          <w:color w:val="FF0077"/>
+          <w:kern w:val="0"/>
+          <w:sz w:val="21"/>
+          <w:szCs w:val="21"/>
+          <w:lang w:eastAsia="en-IN"/>
+          <w14:ligatures w14:val="none"/>
+        </w:rPr>
+        <w:t>li</w:t>
+      </w:r>
+      <w:r>
+        <w:rPr>
+          <w:rFonts w:ascii="Consolas" w:eastAsia="Times New Roman" w:hAnsi="Consolas" w:cs="Times New Roman"/>
+          <w:color w:val="FFFFFF"/>
+          <w:kern w:val="0"/>
+          <w:sz w:val="21"/>
+          <w:szCs w:val="21"/>
+          <w:lang w:eastAsia="en-IN"/>
+          <w14:ligatures w14:val="none"/>
+        </w:rPr>
+        <w:t>&gt;</w:t>
+      </w:r>
+      <w:proofErr w:type="gramStart"/>
+      <w:r>
+        <w:rPr>
+          <w:rFonts w:ascii="Consolas" w:eastAsia="Times New Roman" w:hAnsi="Consolas" w:cs="Times New Roman"/>
+          <w:color w:val="FFFFFF"/>
+          <w:kern w:val="0"/>
+          <w:sz w:val="21"/>
+          <w:szCs w:val="21"/>
+          <w:lang w:eastAsia="en-IN"/>
+          <w14:ligatures w14:val="none"/>
+        </w:rPr>
+        <w:t>nth-child</w:t>
+      </w:r>
+      <w:proofErr w:type="gramEnd"/>
+      <w:r>
+        <w:rPr>
+          <w:rFonts w:ascii="Consolas" w:eastAsia="Times New Roman" w:hAnsi="Consolas" w:cs="Times New Roman"/>
+          <w:color w:val="FFFFFF"/>
+          <w:kern w:val="0"/>
+          <w:sz w:val="21"/>
+          <w:szCs w:val="21"/>
+          <w:lang w:eastAsia="en-IN"/>
+          <w14:ligatures w14:val="none"/>
+        </w:rPr>
+        <w:t>&lt;/</w:t>
+      </w:r>
+      <w:r>
+        <w:rPr>
+          <w:rFonts w:ascii="Consolas" w:eastAsia="Times New Roman" w:hAnsi="Consolas" w:cs="Times New Roman"/>
+          <w:color w:val="FF0077"/>
+          <w:kern w:val="0"/>
+          <w:sz w:val="21"/>
+          <w:szCs w:val="21"/>
+          <w:lang w:eastAsia="en-IN"/>
+          <w14:ligatures w14:val="none"/>
+        </w:rPr>
+        <w:t>li</w:t>
+      </w:r>
+      <w:r>
+        <w:rPr>
+          <w:rFonts w:ascii="Consolas" w:eastAsia="Times New Roman" w:hAnsi="Consolas" w:cs="Times New Roman"/>
+          <w:color w:val="FFFFFF"/>
+          <w:kern w:val="0"/>
+          <w:sz w:val="21"/>
+          <w:szCs w:val="21"/>
+          <w:lang w:eastAsia="en-IN"/>
+          <w14:ligatures w14:val="none"/>
+        </w:rPr>
+        <w:t>&gt;</w:t>
+      </w:r>
+    </w:p>
+    <w:p>
+      <w:pPr>
+        <w:pStyle w:val="ListParagraph"/>
+        <w:numPr>
+          <w:ilvl w:val="0"/>
+          <w:numId w:val="2"/>
+        </w:numPr>
+        <w:shd w:val="clear" w:color="auto" w:fill="00002C"/>
+        <w:spacing w:after="0" w:line="285" w:lineRule="atLeast"/>
+        <w:rPr>
+          <w:rFonts w:ascii="Consolas" w:eastAsia="Times New Roman" w:hAnsi="Consolas" w:cs="Times New Roman"/>
+          <w:color w:val="FFFFFF"/>
+          <w:kern w:val="0"/>
+          <w:sz w:val="21"/>
+          <w:szCs w:val="21"/>
+          <w:lang w:eastAsia="en-IN"/>
+          <w14:ligatures w14:val="none"/>
+        </w:rPr>
+      </w:pPr>
+      <w:r>
+        <w:rPr>
+          <w:rFonts w:ascii="Consolas" w:eastAsia="Times New Roman" w:hAnsi="Consolas" w:cs="Times New Roman"/>
+          <w:color w:val="FFFFFF"/>
+          <w:kern w:val="0"/>
+          <w:sz w:val="21"/>
+          <w:szCs w:val="21"/>
+          <w:lang w:eastAsia="en-IN"/>
+          <w14:ligatures w14:val="none"/>
+        </w:rPr>
+        <w:t>        &lt;</w:t>
+      </w:r>
+      <w:r>
+        <w:rPr>
+          <w:rFonts w:ascii="Consolas" w:eastAsia="Times New Roman" w:hAnsi="Consolas" w:cs="Times New Roman"/>
+          <w:color w:val="FF0077"/>
+          <w:kern w:val="0"/>
+          <w:sz w:val="21"/>
+          <w:szCs w:val="21"/>
+          <w:lang w:eastAsia="en-IN"/>
+          <w14:ligatures w14:val="none"/>
+        </w:rPr>
+        <w:t>li</w:t>
+      </w:r>
+      <w:r>
+        <w:rPr>
+          <w:rFonts w:ascii="Consolas" w:eastAsia="Times New Roman" w:hAnsi="Consolas" w:cs="Times New Roman"/>
+          <w:color w:val="FFFFFF"/>
+          <w:kern w:val="0"/>
+          <w:sz w:val="21"/>
+          <w:szCs w:val="21"/>
+          <w:lang w:eastAsia="en-IN"/>
+          <w14:ligatures w14:val="none"/>
+        </w:rPr>
+        <w:t>&gt;required&lt;/</w:t>
+      </w:r>
+      <w:r>
+        <w:rPr>
+          <w:rFonts w:ascii="Consolas" w:eastAsia="Times New Roman" w:hAnsi="Consolas" w:cs="Times New Roman"/>
+          <w:color w:val="FF0077"/>
+          <w:kern w:val="0"/>
+          <w:sz w:val="21"/>
+          <w:szCs w:val="21"/>
+          <w:lang w:eastAsia="en-IN"/>
+          <w14:ligatures w14:val="none"/>
+        </w:rPr>
+        <w:t>li</w:t>
+      </w:r>
+      <w:r>
+        <w:rPr>
+          <w:rFonts w:ascii="Consolas" w:eastAsia="Times New Roman" w:hAnsi="Consolas" w:cs="Times New Roman"/>
+          <w:color w:val="FFFFFF"/>
+          <w:kern w:val="0"/>
+          <w:sz w:val="21"/>
+          <w:szCs w:val="21"/>
+          <w:lang w:eastAsia="en-IN"/>
+          <w14:ligatures w14:val="none"/>
+        </w:rPr>
+        <w:t>&gt;</w:t>
+      </w:r>
+    </w:p>
+    <w:p>
+      <w:pPr>
+        <w:pStyle w:val="ListParagraph"/>
+        <w:numPr>
+          <w:ilvl w:val="0"/>
+          <w:numId w:val="2"/>
+        </w:numPr>
+        <w:shd w:val="clear" w:color="auto" w:fill="00002C"/>
+        <w:spacing w:after="0" w:line="285" w:lineRule="atLeast"/>
+        <w:rPr>
+          <w:rFonts w:ascii="Consolas" w:eastAsia="Times New Roman" w:hAnsi="Consolas" w:cs="Times New Roman"/>
+          <w:color w:val="FFFFFF"/>
+          <w:kern w:val="0"/>
+          <w:sz w:val="21"/>
+          <w:szCs w:val="21"/>
+          <w:lang w:eastAsia="en-IN"/>
+          <w14:ligatures w14:val="none"/>
+        </w:rPr>
+      </w:pPr>
+      <w:r>
+        <w:rPr>
+          <w:rFonts w:ascii="Consolas" w:eastAsia="Times New Roman" w:hAnsi="Consolas" w:cs="Times New Roman"/>
+          <w:color w:val="FFFFFF"/>
+          <w:kern w:val="0"/>
+          <w:sz w:val="21"/>
+          <w:szCs w:val="21"/>
+          <w:lang w:eastAsia="en-IN"/>
+          <w14:ligatures w14:val="none"/>
+        </w:rPr>
+        <w:t>        &lt;</w:t>
+      </w:r>
+      <w:r>
+        <w:rPr>
+          <w:rFonts w:ascii="Consolas" w:eastAsia="Times New Roman" w:hAnsi="Consolas" w:cs="Times New Roman"/>
+          <w:color w:val="FF0077"/>
+          <w:kern w:val="0"/>
+          <w:sz w:val="21"/>
+          <w:szCs w:val="21"/>
+          <w:lang w:eastAsia="en-IN"/>
+          <w14:ligatures w14:val="none"/>
+        </w:rPr>
+        <w:t>li</w:t>
+      </w:r>
+      <w:r>
+        <w:rPr>
+          <w:rFonts w:ascii="Consolas" w:eastAsia="Times New Roman" w:hAnsi="Consolas" w:cs="Times New Roman"/>
+          <w:color w:val="FFFFFF"/>
+          <w:kern w:val="0"/>
+          <w:sz w:val="21"/>
+          <w:szCs w:val="21"/>
+          <w:lang w:eastAsia="en-IN"/>
+          <w14:ligatures w14:val="none"/>
+        </w:rPr>
+        <w:t>&gt;disabled&lt;/</w:t>
+      </w:r>
+      <w:r>
+        <w:rPr>
+          <w:rFonts w:ascii="Consolas" w:eastAsia="Times New Roman" w:hAnsi="Consolas" w:cs="Times New Roman"/>
+          <w:color w:val="FF0077"/>
+          <w:kern w:val="0"/>
+          <w:sz w:val="21"/>
+          <w:szCs w:val="21"/>
+          <w:lang w:eastAsia="en-IN"/>
+          <w14:ligatures w14:val="none"/>
+        </w:rPr>
+        <w:t>li</w:t>
+      </w:r>
+      <w:r>
+        <w:rPr>
+          <w:rFonts w:ascii="Consolas" w:eastAsia="Times New Roman" w:hAnsi="Consolas" w:cs="Times New Roman"/>
+          <w:color w:val="FFFFFF"/>
+          <w:kern w:val="0"/>
+          <w:sz w:val="21"/>
+          <w:szCs w:val="21"/>
+          <w:lang w:eastAsia="en-IN"/>
+          <w14:ligatures w14:val="none"/>
+        </w:rPr>
+        <w:t>&gt;</w:t>
+      </w:r>
+    </w:p>
+    <w:p>
+      <w:pPr>
+        <w:pStyle w:val="ListParagraph"/>
+        <w:numPr>
+          <w:ilvl w:val="0"/>
+          <w:numId w:val="2"/>
+        </w:numPr>
+        <w:shd w:val="clear" w:color="auto" w:fill="00002C"/>
+        <w:spacing w:after="0" w:line="285" w:lineRule="atLeast"/>
+        <w:rPr>
+          <w:rFonts w:ascii="Consolas" w:eastAsia="Times New Roman" w:hAnsi="Consolas" w:cs="Times New Roman"/>
+          <w:color w:val="FFFFFF"/>
+          <w:kern w:val="0"/>
+          <w:sz w:val="21"/>
+          <w:szCs w:val="21"/>
+          <w:lang w:eastAsia="en-IN"/>
+          <w14:ligatures w14:val="none"/>
+        </w:rPr>
+      </w:pPr>
+      <w:r>
+        <w:rPr>
+          <w:rFonts w:ascii="Consolas" w:eastAsia="Times New Roman" w:hAnsi="Consolas" w:cs="Times New Roman"/>
+          <w:color w:val="FFFFFF"/>
+          <w:kern w:val="0"/>
+          <w:sz w:val="21"/>
+          <w:szCs w:val="21"/>
+          <w:lang w:eastAsia="en-IN"/>
+          <w14:ligatures w14:val="none"/>
+        </w:rPr>
+        <w:t>        &lt;</w:t>
+      </w:r>
+      <w:r>
+        <w:rPr>
+          <w:rFonts w:ascii="Consolas" w:eastAsia="Times New Roman" w:hAnsi="Consolas" w:cs="Times New Roman"/>
+          <w:color w:val="FF0077"/>
+          <w:kern w:val="0"/>
+          <w:sz w:val="21"/>
+          <w:szCs w:val="21"/>
+          <w:lang w:eastAsia="en-IN"/>
+          <w14:ligatures w14:val="none"/>
+        </w:rPr>
+        <w:t>li</w:t>
+      </w:r>
+      <w:r>
+        <w:rPr>
+          <w:rFonts w:ascii="Consolas" w:eastAsia="Times New Roman" w:hAnsi="Consolas" w:cs="Times New Roman"/>
+          <w:color w:val="FFFFFF"/>
+          <w:kern w:val="0"/>
+          <w:sz w:val="21"/>
+          <w:szCs w:val="21"/>
+          <w:lang w:eastAsia="en-IN"/>
+          <w14:ligatures w14:val="none"/>
+        </w:rPr>
+        <w:t>&gt;link&lt;/</w:t>
+      </w:r>
+      <w:r>
+        <w:rPr>
+          <w:rFonts w:ascii="Consolas" w:eastAsia="Times New Roman" w:hAnsi="Consolas" w:cs="Times New Roman"/>
+          <w:color w:val="FF0077"/>
+          <w:kern w:val="0"/>
+          <w:sz w:val="21"/>
+          <w:szCs w:val="21"/>
+          <w:lang w:eastAsia="en-IN"/>
+          <w14:ligatures w14:val="none"/>
+        </w:rPr>
+        <w:t>li</w:t>
+      </w:r>
+      <w:r>
+        <w:rPr>
+          <w:rFonts w:ascii="Consolas" w:eastAsia="Times New Roman" w:hAnsi="Consolas" w:cs="Times New Roman"/>
+          <w:color w:val="FFFFFF"/>
+          <w:kern w:val="0"/>
+          <w:sz w:val="21"/>
+          <w:szCs w:val="21"/>
+          <w:lang w:eastAsia="en-IN"/>
+          <w14:ligatures w14:val="none"/>
+        </w:rPr>
+        <w:t>&gt;</w:t>
+      </w:r>
+    </w:p>
+    <w:p>
+      <w:pPr>
+        <w:pStyle w:val="ListParagraph"/>
+        <w:numPr>
+          <w:ilvl w:val="0"/>
+          <w:numId w:val="2"/>
+        </w:numPr>
+        <w:shd w:val="clear" w:color="auto" w:fill="00002C"/>
+        <w:spacing w:after="0" w:line="285" w:lineRule="atLeast"/>
+        <w:rPr>
+          <w:rFonts w:ascii="Consolas" w:eastAsia="Times New Roman" w:hAnsi="Consolas" w:cs="Times New Roman"/>
+          <w:color w:val="FFFFFF"/>
+          <w:kern w:val="0"/>
+          <w:sz w:val="21"/>
+          <w:szCs w:val="21"/>
+          <w:lang w:eastAsia="en-IN"/>
+          <w14:ligatures w14:val="none"/>
+        </w:rPr>
+      </w:pPr>
+      <w:r>
+        <w:rPr>
+          <w:rFonts w:ascii="Consolas" w:eastAsia="Times New Roman" w:hAnsi="Consolas" w:cs="Times New Roman"/>
+          <w:color w:val="FFFFFF"/>
+          <w:kern w:val="0"/>
+          <w:sz w:val="21"/>
+          <w:szCs w:val="21"/>
+          <w:lang w:eastAsia="en-IN"/>
+          <w14:ligatures w14:val="none"/>
+        </w:rPr>
+        <w:t>    &lt;/</w:t>
+      </w:r>
+      <w:proofErr w:type="spellStart"/>
+      <w:r>
+        <w:rPr>
+          <w:rFonts w:ascii="Consolas" w:eastAsia="Times New Roman" w:hAnsi="Consolas" w:cs="Times New Roman"/>
+          <w:color w:val="FF0077"/>
+          <w:kern w:val="0"/>
+          <w:sz w:val="21"/>
+          <w:szCs w:val="21"/>
+          <w:lang w:eastAsia="en-IN"/>
+          <w14:ligatures w14:val="none"/>
+        </w:rPr>
+        <w:t>ol</w:t>
+      </w:r>
+      <w:proofErr w:type="spellEnd"/>
+      <w:r>
+        <w:rPr>
+          <w:rFonts w:ascii="Consolas" w:eastAsia="Times New Roman" w:hAnsi="Consolas" w:cs="Times New Roman"/>
+          <w:color w:val="FFFFFF"/>
+          <w:kern w:val="0"/>
+          <w:sz w:val="21"/>
+          <w:szCs w:val="21"/>
+          <w:lang w:eastAsia="en-IN"/>
+          <w14:ligatures w14:val="none"/>
+        </w:rPr>
+        <w:t>&gt;</w:t>
+      </w:r>
+    </w:p>
+    <w:p>
+      <w:pPr>
+        <w:pStyle w:val="ListParagraph"/>
+        <w:numPr>
+          <w:ilvl w:val="0"/>
+          <w:numId w:val="2"/>
+        </w:numPr>
+        <w:shd w:val="clear" w:color="auto" w:fill="00002C"/>
+        <w:spacing w:after="0" w:line="285" w:lineRule="atLeast"/>
+        <w:rPr>
+          <w:rFonts w:ascii="Consolas" w:eastAsia="Times New Roman" w:hAnsi="Consolas" w:cs="Times New Roman"/>
+          <w:color w:val="FFFFFF"/>
+          <w:kern w:val="0"/>
+          <w:sz w:val="21"/>
+          <w:szCs w:val="21"/>
+          <w:lang w:eastAsia="en-IN"/>
+          <w14:ligatures w14:val="none"/>
+        </w:rPr>
+      </w:pPr>
+      <w:r>
+        <w:rPr>
+          <w:rFonts w:ascii="Consolas" w:eastAsia="Times New Roman" w:hAnsi="Consolas" w:cs="Times New Roman"/>
+          <w:color w:val="FFFFFF"/>
+          <w:kern w:val="0"/>
+          <w:sz w:val="21"/>
+          <w:szCs w:val="21"/>
+          <w:lang w:eastAsia="en-IN"/>
+          <w14:ligatures w14:val="none"/>
+        </w:rPr>
+        <w:t>    &lt;</w:t>
+      </w:r>
+      <w:r>
+        <w:rPr>
+          <w:rFonts w:ascii="Consolas" w:eastAsia="Times New Roman" w:hAnsi="Consolas" w:cs="Times New Roman"/>
+          <w:color w:val="FF0077"/>
+          <w:kern w:val="0"/>
+          <w:sz w:val="21"/>
+          <w:szCs w:val="21"/>
+          <w:lang w:eastAsia="en-IN"/>
+          <w14:ligatures w14:val="none"/>
+        </w:rPr>
+        <w:t>h1</w:t>
+      </w:r>
+      <w:r>
+        <w:rPr>
+          <w:rFonts w:ascii="Consolas" w:eastAsia="Times New Roman" w:hAnsi="Consolas" w:cs="Times New Roman"/>
+          <w:color w:val="FFFFFF"/>
+          <w:kern w:val="0"/>
+          <w:sz w:val="21"/>
+          <w:szCs w:val="21"/>
+          <w:lang w:eastAsia="en-IN"/>
+          <w14:ligatures w14:val="none"/>
+        </w:rPr>
+        <w:t>&gt;&lt;</w:t>
+      </w:r>
+      <w:r>
+        <w:rPr>
+          <w:rFonts w:ascii="Consolas" w:eastAsia="Times New Roman" w:hAnsi="Consolas" w:cs="Times New Roman"/>
+          <w:color w:val="FF0077"/>
+          <w:kern w:val="0"/>
+          <w:sz w:val="21"/>
+          <w:szCs w:val="21"/>
+          <w:lang w:eastAsia="en-IN"/>
+          <w14:ligatures w14:val="none"/>
+        </w:rPr>
+        <w:t>a</w:t>
+      </w:r>
+      <w:r>
+        <w:rPr>
+          <w:rFonts w:ascii="Consolas" w:eastAsia="Times New Roman" w:hAnsi="Consolas" w:cs="Times New Roman"/>
+          <w:color w:val="FFFFFF"/>
+          <w:kern w:val="0"/>
+          <w:sz w:val="21"/>
+          <w:szCs w:val="21"/>
+          <w:lang w:eastAsia="en-IN"/>
+          <w14:ligatures w14:val="none"/>
+        </w:rPr>
+        <w:t xml:space="preserve"> </w:t>
+      </w:r>
+      <w:proofErr w:type="spellStart"/>
+      <w:r>
+        <w:rPr>
+          <w:rFonts w:ascii="Consolas" w:eastAsia="Times New Roman" w:hAnsi="Consolas" w:cs="Times New Roman"/>
+          <w:color w:val="00FFF2"/>
+          <w:kern w:val="0"/>
+          <w:sz w:val="21"/>
+          <w:szCs w:val="21"/>
+          <w:lang w:eastAsia="en-IN"/>
+          <w14:ligatures w14:val="none"/>
+        </w:rPr>
+        <w:t>href</w:t>
+      </w:r>
+      <w:proofErr w:type="spellEnd"/>
+      <w:r>
+        <w:rPr>
+          <w:rFonts w:ascii="Consolas" w:eastAsia="Times New Roman" w:hAnsi="Consolas" w:cs="Times New Roman"/>
+          <w:color w:val="FFFFFF"/>
+          <w:kern w:val="0"/>
+          <w:sz w:val="21"/>
+          <w:szCs w:val="21"/>
+          <w:lang w:eastAsia="en-IN"/>
+          <w14:ligatures w14:val="none"/>
+        </w:rPr>
+        <w:t>="</w:t>
+      </w:r>
+      <w:r>
+        <w:rPr>
+          <w:rFonts w:ascii="Consolas" w:eastAsia="Times New Roman" w:hAnsi="Consolas" w:cs="Times New Roman"/>
+          <w:color w:val="EEFF00"/>
+          <w:kern w:val="0"/>
+          <w:sz w:val="21"/>
+          <w:szCs w:val="21"/>
+          <w:lang w:eastAsia="en-IN"/>
+          <w14:ligatures w14:val="none"/>
+        </w:rPr>
+        <w:t>https://www.google.com</w:t>
+      </w:r>
+      <w:r>
+        <w:rPr>
+          <w:rFonts w:ascii="Consolas" w:eastAsia="Times New Roman" w:hAnsi="Consolas" w:cs="Times New Roman"/>
+          <w:color w:val="FFFFFF"/>
+          <w:kern w:val="0"/>
+          <w:sz w:val="21"/>
+          <w:szCs w:val="21"/>
+          <w:lang w:eastAsia="en-IN"/>
+          <w14:ligatures w14:val="none"/>
+        </w:rPr>
+        <w:t>"&gt;Google&lt;/</w:t>
+      </w:r>
+      <w:r>
+        <w:rPr>
+          <w:rFonts w:ascii="Consolas" w:eastAsia="Times New Roman" w:hAnsi="Consolas" w:cs="Times New Roman"/>
+          <w:color w:val="FF0077"/>
+          <w:kern w:val="0"/>
+          <w:sz w:val="21"/>
+          <w:szCs w:val="21"/>
+          <w:lang w:eastAsia="en-IN"/>
+          <w14:ligatures w14:val="none"/>
+        </w:rPr>
+        <w:t>a</w:t>
+      </w:r>
+      <w:r>
+        <w:rPr>
+          <w:rFonts w:ascii="Consolas" w:eastAsia="Times New Roman" w:hAnsi="Consolas" w:cs="Times New Roman"/>
+          <w:color w:val="FFFFFF"/>
+          <w:kern w:val="0"/>
+          <w:sz w:val="21"/>
+          <w:szCs w:val="21"/>
+          <w:lang w:eastAsia="en-IN"/>
+          <w14:ligatures w14:val="none"/>
+        </w:rPr>
+        <w:t>&gt;&lt;/</w:t>
+      </w:r>
+      <w:r>
+        <w:rPr>
+          <w:rFonts w:ascii="Consolas" w:eastAsia="Times New Roman" w:hAnsi="Consolas" w:cs="Times New Roman"/>
+          <w:color w:val="FF0077"/>
+          <w:kern w:val="0"/>
+          <w:sz w:val="21"/>
+          <w:szCs w:val="21"/>
+          <w:lang w:eastAsia="en-IN"/>
+          <w14:ligatures w14:val="none"/>
+        </w:rPr>
+        <w:t>h1</w:t>
+      </w:r>
+      <w:r>
+        <w:rPr>
+          <w:rFonts w:ascii="Consolas" w:eastAsia="Times New Roman" w:hAnsi="Consolas" w:cs="Times New Roman"/>
+          <w:color w:val="FFFFFF"/>
+          <w:kern w:val="0"/>
+          <w:sz w:val="21"/>
+          <w:szCs w:val="21"/>
+          <w:lang w:eastAsia="en-IN"/>
+          <w14:ligatures w14:val="none"/>
+        </w:rPr>
+        <w:t>&gt;</w:t>
+      </w:r>
+    </w:p>
+    <w:p>
+      <w:pPr>
+        <w:pStyle w:val="ListParagraph"/>
+        <w:numPr>
+          <w:ilvl w:val="0"/>
+          <w:numId w:val="2"/>
+        </w:numPr>
+        <w:shd w:val="clear" w:color="auto" w:fill="00002C"/>
+        <w:spacing w:after="0" w:line="285" w:lineRule="atLeast"/>
+        <w:rPr>
+          <w:rFonts w:ascii="Consolas" w:eastAsia="Times New Roman" w:hAnsi="Consolas" w:cs="Times New Roman"/>
+          <w:color w:val="FFFFFF"/>
+          <w:kern w:val="0"/>
+          <w:sz w:val="21"/>
+          <w:szCs w:val="21"/>
+          <w:lang w:eastAsia="en-IN"/>
+          <w14:ligatures w14:val="none"/>
+        </w:rPr>
+      </w:pPr>
+    </w:p>
+    <w:p>
+      <w:pPr>
+        <w:pStyle w:val="ListParagraph"/>
+        <w:numPr>
+          <w:ilvl w:val="0"/>
+          <w:numId w:val="2"/>
+        </w:numPr>
+        <w:shd w:val="clear" w:color="auto" w:fill="00002C"/>
+        <w:spacing w:after="0" w:line="285" w:lineRule="atLeast"/>
+        <w:rPr>
+          <w:rFonts w:ascii="Consolas" w:eastAsia="Times New Roman" w:hAnsi="Consolas" w:cs="Times New Roman"/>
+          <w:color w:val="FFFFFF"/>
+          <w:kern w:val="0"/>
+          <w:sz w:val="21"/>
+          <w:szCs w:val="21"/>
+          <w:lang w:eastAsia="en-IN"/>
+          <w14:ligatures w14:val="none"/>
+        </w:rPr>
+      </w:pPr>
+      <w:r>
+        <w:rPr>
+          <w:rFonts w:ascii="Consolas" w:eastAsia="Times New Roman" w:hAnsi="Consolas" w:cs="Times New Roman"/>
+          <w:color w:val="FFFFFF"/>
+          <w:kern w:val="0"/>
+          <w:sz w:val="21"/>
+          <w:szCs w:val="21"/>
+          <w:lang w:eastAsia="en-IN"/>
+          <w14:ligatures w14:val="none"/>
+        </w:rPr>
+        <w:t>    &lt;</w:t>
+      </w:r>
+      <w:r>
+        <w:rPr>
+          <w:rFonts w:ascii="Consolas" w:eastAsia="Times New Roman" w:hAnsi="Consolas" w:cs="Times New Roman"/>
+          <w:color w:val="FF0077"/>
+          <w:kern w:val="0"/>
+          <w:sz w:val="21"/>
+          <w:szCs w:val="21"/>
+          <w:lang w:eastAsia="en-IN"/>
+          <w14:ligatures w14:val="none"/>
+        </w:rPr>
+        <w:t>h1</w:t>
+      </w:r>
+      <w:r>
+        <w:rPr>
+          <w:rFonts w:ascii="Consolas" w:eastAsia="Times New Roman" w:hAnsi="Consolas" w:cs="Times New Roman"/>
+          <w:color w:val="FFFFFF"/>
+          <w:kern w:val="0"/>
+          <w:sz w:val="21"/>
+          <w:szCs w:val="21"/>
+          <w:lang w:eastAsia="en-IN"/>
+          <w14:ligatures w14:val="none"/>
+        </w:rPr>
+        <w:t>&gt;</w:t>
+      </w:r>
+      <w:proofErr w:type="spellStart"/>
+      <w:r>
+        <w:rPr>
+          <w:rFonts w:ascii="Consolas" w:eastAsia="Times New Roman" w:hAnsi="Consolas" w:cs="Times New Roman"/>
+          <w:color w:val="FFFFFF"/>
+          <w:kern w:val="0"/>
+          <w:sz w:val="21"/>
+          <w:szCs w:val="21"/>
+          <w:lang w:eastAsia="en-IN"/>
+          <w14:ligatures w14:val="none"/>
+        </w:rPr>
+        <w:t>Pseduo</w:t>
+      </w:r>
+      <w:proofErr w:type="spellEnd"/>
+      <w:r>
+        <w:rPr>
+          <w:rFonts w:ascii="Consolas" w:eastAsia="Times New Roman" w:hAnsi="Consolas" w:cs="Times New Roman"/>
+          <w:color w:val="FFFFFF"/>
+          <w:kern w:val="0"/>
+          <w:sz w:val="21"/>
+          <w:szCs w:val="21"/>
+          <w:lang w:eastAsia="en-IN"/>
+          <w14:ligatures w14:val="none"/>
+        </w:rPr>
+        <w:t xml:space="preserve"> Element Selector&lt;/</w:t>
+      </w:r>
+      <w:r>
+        <w:rPr>
+          <w:rFonts w:ascii="Consolas" w:eastAsia="Times New Roman" w:hAnsi="Consolas" w:cs="Times New Roman"/>
+          <w:color w:val="FF0077"/>
+          <w:kern w:val="0"/>
+          <w:sz w:val="21"/>
+          <w:szCs w:val="21"/>
+          <w:lang w:eastAsia="en-IN"/>
+          <w14:ligatures w14:val="none"/>
+        </w:rPr>
+        <w:t>h1</w:t>
+      </w:r>
+      <w:r>
+        <w:rPr>
+          <w:rFonts w:ascii="Consolas" w:eastAsia="Times New Roman" w:hAnsi="Consolas" w:cs="Times New Roman"/>
+          <w:color w:val="FFFFFF"/>
+          <w:kern w:val="0"/>
+          <w:sz w:val="21"/>
+          <w:szCs w:val="21"/>
+          <w:lang w:eastAsia="en-IN"/>
+          <w14:ligatures w14:val="none"/>
+        </w:rPr>
+        <w:t>&gt;</w:t>
+      </w:r>
+    </w:p>
+    <w:p>
+      <w:pPr>
+        <w:pStyle w:val="ListParagraph"/>
+        <w:numPr>
+          <w:ilvl w:val="0"/>
+          <w:numId w:val="2"/>
+        </w:numPr>
+        <w:shd w:val="clear" w:color="auto" w:fill="00002C"/>
+        <w:spacing w:after="0" w:line="285" w:lineRule="atLeast"/>
+        <w:rPr>
+          <w:rFonts w:ascii="Consolas" w:eastAsia="Times New Roman" w:hAnsi="Consolas" w:cs="Times New Roman"/>
+          <w:color w:val="FFFFFF"/>
+          <w:kern w:val="0"/>
+          <w:sz w:val="21"/>
+          <w:szCs w:val="21"/>
+          <w:lang w:eastAsia="en-IN"/>
+          <w14:ligatures w14:val="none"/>
+        </w:rPr>
+      </w:pPr>
+      <w:r>
+        <w:rPr>
+          <w:rFonts w:ascii="Consolas" w:eastAsia="Times New Roman" w:hAnsi="Consolas" w:cs="Times New Roman"/>
+          <w:color w:val="FFFFFF"/>
+          <w:kern w:val="0"/>
+          <w:sz w:val="21"/>
+          <w:szCs w:val="21"/>
+          <w:lang w:eastAsia="en-IN"/>
+          <w14:ligatures w14:val="none"/>
+        </w:rPr>
+        <w:t>    &lt;</w:t>
+      </w:r>
+      <w:r>
+        <w:rPr>
+          <w:rFonts w:ascii="Consolas" w:eastAsia="Times New Roman" w:hAnsi="Consolas" w:cs="Times New Roman"/>
+          <w:color w:val="FF0077"/>
+          <w:kern w:val="0"/>
+          <w:sz w:val="21"/>
+          <w:szCs w:val="21"/>
+          <w:lang w:eastAsia="en-IN"/>
+          <w14:ligatures w14:val="none"/>
+        </w:rPr>
+        <w:t>p</w:t>
+      </w:r>
+      <w:r>
+        <w:rPr>
+          <w:rFonts w:ascii="Consolas" w:eastAsia="Times New Roman" w:hAnsi="Consolas" w:cs="Times New Roman"/>
+          <w:color w:val="FFFFFF"/>
+          <w:kern w:val="0"/>
+          <w:sz w:val="21"/>
+          <w:szCs w:val="21"/>
+          <w:lang w:eastAsia="en-IN"/>
+          <w14:ligatures w14:val="none"/>
+        </w:rPr>
+        <w:t>&gt;It is used to style a particular part of an HTML document rather than styling a whole element. &lt;/</w:t>
+      </w:r>
+      <w:r>
+        <w:rPr>
+          <w:rFonts w:ascii="Consolas" w:eastAsia="Times New Roman" w:hAnsi="Consolas" w:cs="Times New Roman"/>
+          <w:color w:val="FF0077"/>
+          <w:kern w:val="0"/>
+          <w:sz w:val="21"/>
+          <w:szCs w:val="21"/>
+          <w:lang w:eastAsia="en-IN"/>
+          <w14:ligatures w14:val="none"/>
+        </w:rPr>
+        <w:t>p</w:t>
+      </w:r>
+      <w:r>
+        <w:rPr>
+          <w:rFonts w:ascii="Consolas" w:eastAsia="Times New Roman" w:hAnsi="Consolas" w:cs="Times New Roman"/>
+          <w:color w:val="FFFFFF"/>
+          <w:kern w:val="0"/>
+          <w:sz w:val="21"/>
+          <w:szCs w:val="21"/>
+          <w:lang w:eastAsia="en-IN"/>
+          <w14:ligatures w14:val="none"/>
+        </w:rPr>
+        <w:t>&gt;</w:t>
+      </w:r>
+    </w:p>
+    <w:p>
+      <w:pPr>
+        <w:pStyle w:val="ListParagraph"/>
+        <w:numPr>
+          <w:ilvl w:val="0"/>
+          <w:numId w:val="2"/>
+        </w:numPr>
+        <w:shd w:val="clear" w:color="auto" w:fill="00002C"/>
+        <w:spacing w:after="0" w:line="285" w:lineRule="atLeast"/>
+        <w:rPr>
+          <w:rFonts w:ascii="Consolas" w:eastAsia="Times New Roman" w:hAnsi="Consolas" w:cs="Times New Roman"/>
+          <w:color w:val="FFFFFF"/>
+          <w:kern w:val="0"/>
+          <w:sz w:val="21"/>
+          <w:szCs w:val="21"/>
+          <w:lang w:eastAsia="en-IN"/>
+          <w14:ligatures w14:val="none"/>
+        </w:rPr>
+      </w:pPr>
+      <w:r>
+        <w:rPr>
+          <w:rFonts w:ascii="Consolas" w:eastAsia="Times New Roman" w:hAnsi="Consolas" w:cs="Times New Roman"/>
+          <w:color w:val="FFFFFF"/>
+          <w:kern w:val="0"/>
+          <w:sz w:val="21"/>
+          <w:szCs w:val="21"/>
+          <w:lang w:eastAsia="en-IN"/>
+          <w14:ligatures w14:val="none"/>
+        </w:rPr>
+        <w:t>    &lt;</w:t>
+      </w:r>
+      <w:proofErr w:type="spellStart"/>
+      <w:r>
+        <w:rPr>
+          <w:rFonts w:ascii="Consolas" w:eastAsia="Times New Roman" w:hAnsi="Consolas" w:cs="Times New Roman"/>
+          <w:color w:val="FF0077"/>
+          <w:kern w:val="0"/>
+          <w:sz w:val="21"/>
+          <w:szCs w:val="21"/>
+          <w:lang w:eastAsia="en-IN"/>
+          <w14:ligatures w14:val="none"/>
+        </w:rPr>
+        <w:t>ol</w:t>
+      </w:r>
+      <w:proofErr w:type="spellEnd"/>
+      <w:r>
+        <w:rPr>
+          <w:rFonts w:ascii="Consolas" w:eastAsia="Times New Roman" w:hAnsi="Consolas" w:cs="Times New Roman"/>
+          <w:color w:val="FFFFFF"/>
+          <w:kern w:val="0"/>
+          <w:sz w:val="21"/>
+          <w:szCs w:val="21"/>
+          <w:lang w:eastAsia="en-IN"/>
+          <w14:ligatures w14:val="none"/>
+        </w:rPr>
+        <w:t>&gt;</w:t>
+      </w:r>
+    </w:p>
+    <w:p>
+      <w:pPr>
+        <w:pStyle w:val="ListParagraph"/>
+        <w:numPr>
+          <w:ilvl w:val="0"/>
+          <w:numId w:val="2"/>
+        </w:numPr>
+        <w:shd w:val="clear" w:color="auto" w:fill="00002C"/>
+        <w:spacing w:after="0" w:line="285" w:lineRule="atLeast"/>
+        <w:rPr>
+          <w:rFonts w:ascii="Consolas" w:eastAsia="Times New Roman" w:hAnsi="Consolas" w:cs="Times New Roman"/>
+          <w:color w:val="FFFFFF"/>
+          <w:kern w:val="0"/>
+          <w:sz w:val="21"/>
+          <w:szCs w:val="21"/>
+          <w:lang w:eastAsia="en-IN"/>
+          <w14:ligatures w14:val="none"/>
+        </w:rPr>
+      </w:pPr>
+      <w:r>
+        <w:rPr>
+          <w:rFonts w:ascii="Consolas" w:eastAsia="Times New Roman" w:hAnsi="Consolas" w:cs="Times New Roman"/>
+          <w:color w:val="FFFFFF"/>
+          <w:kern w:val="0"/>
+          <w:sz w:val="21"/>
+          <w:szCs w:val="21"/>
+          <w:lang w:eastAsia="en-IN"/>
+          <w14:ligatures w14:val="none"/>
+        </w:rPr>
+        <w:t>        &lt;</w:t>
+      </w:r>
+      <w:r>
+        <w:rPr>
+          <w:rFonts w:ascii="Consolas" w:eastAsia="Times New Roman" w:hAnsi="Consolas" w:cs="Times New Roman"/>
+          <w:color w:val="FF0077"/>
+          <w:kern w:val="0"/>
+          <w:sz w:val="21"/>
+          <w:szCs w:val="21"/>
+          <w:lang w:eastAsia="en-IN"/>
+          <w14:ligatures w14:val="none"/>
+        </w:rPr>
+        <w:t>li</w:t>
+      </w:r>
+      <w:r>
+        <w:rPr>
+          <w:rFonts w:ascii="Consolas" w:eastAsia="Times New Roman" w:hAnsi="Consolas" w:cs="Times New Roman"/>
+          <w:color w:val="FFFFFF"/>
+          <w:kern w:val="0"/>
+          <w:sz w:val="21"/>
+          <w:szCs w:val="21"/>
+          <w:lang w:eastAsia="en-IN"/>
+          <w14:ligatures w14:val="none"/>
+        </w:rPr>
+        <w:t>&gt;</w:t>
+      </w:r>
+      <w:proofErr w:type="gramStart"/>
+      <w:r>
+        <w:rPr>
+          <w:rFonts w:ascii="Consolas" w:eastAsia="Times New Roman" w:hAnsi="Consolas" w:cs="Times New Roman"/>
+          <w:color w:val="FFFFFF"/>
+          <w:kern w:val="0"/>
+          <w:sz w:val="21"/>
+          <w:szCs w:val="21"/>
+          <w:lang w:eastAsia="en-IN"/>
+          <w14:ligatures w14:val="none"/>
+        </w:rPr>
+        <w:t>First-letter</w:t>
+      </w:r>
+      <w:proofErr w:type="gramEnd"/>
+      <w:r>
+        <w:rPr>
+          <w:rFonts w:ascii="Consolas" w:eastAsia="Times New Roman" w:hAnsi="Consolas" w:cs="Times New Roman"/>
+          <w:color w:val="FFFFFF"/>
+          <w:kern w:val="0"/>
+          <w:sz w:val="21"/>
+          <w:szCs w:val="21"/>
+          <w:lang w:eastAsia="en-IN"/>
+          <w14:ligatures w14:val="none"/>
+        </w:rPr>
+        <w:t>&lt;/</w:t>
+      </w:r>
+      <w:r>
+        <w:rPr>
+          <w:rFonts w:ascii="Consolas" w:eastAsia="Times New Roman" w:hAnsi="Consolas" w:cs="Times New Roman"/>
+          <w:color w:val="FF0077"/>
+          <w:kern w:val="0"/>
+          <w:sz w:val="21"/>
+          <w:szCs w:val="21"/>
+          <w:lang w:eastAsia="en-IN"/>
+          <w14:ligatures w14:val="none"/>
+        </w:rPr>
+        <w:t>li</w:t>
+      </w:r>
+      <w:r>
+        <w:rPr>
+          <w:rFonts w:ascii="Consolas" w:eastAsia="Times New Roman" w:hAnsi="Consolas" w:cs="Times New Roman"/>
+          <w:color w:val="FFFFFF"/>
+          <w:kern w:val="0"/>
+          <w:sz w:val="21"/>
+          <w:szCs w:val="21"/>
+          <w:lang w:eastAsia="en-IN"/>
+          <w14:ligatures w14:val="none"/>
+        </w:rPr>
+        <w:t>&gt;</w:t>
+      </w:r>
+    </w:p>
+    <w:p>
+      <w:pPr>
+        <w:pStyle w:val="ListParagraph"/>
+        <w:numPr>
+          <w:ilvl w:val="0"/>
+          <w:numId w:val="2"/>
+        </w:numPr>
+        <w:shd w:val="clear" w:color="auto" w:fill="00002C"/>
+        <w:spacing w:after="0" w:line="285" w:lineRule="atLeast"/>
+        <w:rPr>
+          <w:rFonts w:ascii="Consolas" w:eastAsia="Times New Roman" w:hAnsi="Consolas" w:cs="Times New Roman"/>
+          <w:color w:val="FFFFFF"/>
+          <w:kern w:val="0"/>
+          <w:sz w:val="21"/>
+          <w:szCs w:val="21"/>
+          <w:lang w:eastAsia="en-IN"/>
+          <w14:ligatures w14:val="none"/>
+        </w:rPr>
+      </w:pPr>
+      <w:r>
+        <w:rPr>
+          <w:rFonts w:ascii="Consolas" w:eastAsia="Times New Roman" w:hAnsi="Consolas" w:cs="Times New Roman"/>
+          <w:color w:val="FFFFFF"/>
+          <w:kern w:val="0"/>
+          <w:sz w:val="21"/>
+          <w:szCs w:val="21"/>
+          <w:lang w:eastAsia="en-IN"/>
+          <w14:ligatures w14:val="none"/>
+        </w:rPr>
+        <w:t>        &lt;</w:t>
+      </w:r>
+      <w:r>
+        <w:rPr>
+          <w:rFonts w:ascii="Consolas" w:eastAsia="Times New Roman" w:hAnsi="Consolas" w:cs="Times New Roman"/>
+          <w:color w:val="FF0077"/>
+          <w:kern w:val="0"/>
+          <w:sz w:val="21"/>
+          <w:szCs w:val="21"/>
+          <w:lang w:eastAsia="en-IN"/>
+          <w14:ligatures w14:val="none"/>
+        </w:rPr>
+        <w:t>li</w:t>
+      </w:r>
+      <w:r>
+        <w:rPr>
+          <w:rFonts w:ascii="Consolas" w:eastAsia="Times New Roman" w:hAnsi="Consolas" w:cs="Times New Roman"/>
+          <w:color w:val="FFFFFF"/>
+          <w:kern w:val="0"/>
+          <w:sz w:val="21"/>
+          <w:szCs w:val="21"/>
+          <w:lang w:eastAsia="en-IN"/>
+          <w14:ligatures w14:val="none"/>
+        </w:rPr>
+        <w:t>&gt;</w:t>
+      </w:r>
+      <w:proofErr w:type="gramStart"/>
+      <w:r>
+        <w:rPr>
+          <w:rFonts w:ascii="Consolas" w:eastAsia="Times New Roman" w:hAnsi="Consolas" w:cs="Times New Roman"/>
+          <w:color w:val="FFFFFF"/>
+          <w:kern w:val="0"/>
+          <w:sz w:val="21"/>
+          <w:szCs w:val="21"/>
+          <w:lang w:eastAsia="en-IN"/>
+          <w14:ligatures w14:val="none"/>
+        </w:rPr>
+        <w:t>first-line</w:t>
+      </w:r>
+      <w:proofErr w:type="gramEnd"/>
+      <w:r>
+        <w:rPr>
+          <w:rFonts w:ascii="Consolas" w:eastAsia="Times New Roman" w:hAnsi="Consolas" w:cs="Times New Roman"/>
+          <w:color w:val="FFFFFF"/>
+          <w:kern w:val="0"/>
+          <w:sz w:val="21"/>
+          <w:szCs w:val="21"/>
+          <w:lang w:eastAsia="en-IN"/>
+          <w14:ligatures w14:val="none"/>
+        </w:rPr>
+        <w:t>&lt;/</w:t>
+      </w:r>
+      <w:r>
+        <w:rPr>
+          <w:rFonts w:ascii="Consolas" w:eastAsia="Times New Roman" w:hAnsi="Consolas" w:cs="Times New Roman"/>
+          <w:color w:val="FF0077"/>
+          <w:kern w:val="0"/>
+          <w:sz w:val="21"/>
+          <w:szCs w:val="21"/>
+          <w:lang w:eastAsia="en-IN"/>
+          <w14:ligatures w14:val="none"/>
+        </w:rPr>
+        <w:t>li</w:t>
+      </w:r>
+      <w:r>
+        <w:rPr>
+          <w:rFonts w:ascii="Consolas" w:eastAsia="Times New Roman" w:hAnsi="Consolas" w:cs="Times New Roman"/>
+          <w:color w:val="FFFFFF"/>
+          <w:kern w:val="0"/>
+          <w:sz w:val="21"/>
+          <w:szCs w:val="21"/>
+          <w:lang w:eastAsia="en-IN"/>
+          <w14:ligatures w14:val="none"/>
+        </w:rPr>
+        <w:t>&gt;</w:t>
+      </w:r>
+    </w:p>
+    <w:p>
+      <w:pPr>
+        <w:pStyle w:val="ListParagraph"/>
+        <w:numPr>
+          <w:ilvl w:val="0"/>
+          <w:numId w:val="2"/>
+        </w:numPr>
+        <w:shd w:val="clear" w:color="auto" w:fill="00002C"/>
+        <w:spacing w:after="0" w:line="285" w:lineRule="atLeast"/>
+        <w:rPr>
+          <w:rFonts w:ascii="Consolas" w:eastAsia="Times New Roman" w:hAnsi="Consolas" w:cs="Times New Roman"/>
+          <w:color w:val="FFFFFF"/>
+          <w:kern w:val="0"/>
+          <w:sz w:val="21"/>
+          <w:szCs w:val="21"/>
+          <w:lang w:eastAsia="en-IN"/>
+          <w14:ligatures w14:val="none"/>
+        </w:rPr>
+      </w:pPr>
+      <w:r>
+        <w:rPr>
+          <w:rFonts w:ascii="Consolas" w:eastAsia="Times New Roman" w:hAnsi="Consolas" w:cs="Times New Roman"/>
+          <w:color w:val="FFFFFF"/>
+          <w:kern w:val="0"/>
+          <w:sz w:val="21"/>
+          <w:szCs w:val="21"/>
+          <w:lang w:eastAsia="en-IN"/>
+          <w14:ligatures w14:val="none"/>
+        </w:rPr>
+        <w:t>        &lt;</w:t>
+      </w:r>
+      <w:r>
+        <w:rPr>
+          <w:rFonts w:ascii="Consolas" w:eastAsia="Times New Roman" w:hAnsi="Consolas" w:cs="Times New Roman"/>
+          <w:color w:val="FF0077"/>
+          <w:kern w:val="0"/>
+          <w:sz w:val="21"/>
+          <w:szCs w:val="21"/>
+          <w:lang w:eastAsia="en-IN"/>
+          <w14:ligatures w14:val="none"/>
+        </w:rPr>
+        <w:t>li</w:t>
+      </w:r>
+      <w:r>
+        <w:rPr>
+          <w:rFonts w:ascii="Consolas" w:eastAsia="Times New Roman" w:hAnsi="Consolas" w:cs="Times New Roman"/>
+          <w:color w:val="FFFFFF"/>
+          <w:kern w:val="0"/>
+          <w:sz w:val="21"/>
+          <w:szCs w:val="21"/>
+          <w:lang w:eastAsia="en-IN"/>
+          <w14:ligatures w14:val="none"/>
+        </w:rPr>
+        <w:t>&gt;placeholder&lt;/</w:t>
+      </w:r>
+      <w:r>
+        <w:rPr>
+          <w:rFonts w:ascii="Consolas" w:eastAsia="Times New Roman" w:hAnsi="Consolas" w:cs="Times New Roman"/>
+          <w:color w:val="FF0077"/>
+          <w:kern w:val="0"/>
+          <w:sz w:val="21"/>
+          <w:szCs w:val="21"/>
+          <w:lang w:eastAsia="en-IN"/>
+          <w14:ligatures w14:val="none"/>
+        </w:rPr>
+        <w:t>li</w:t>
+      </w:r>
+      <w:r>
+        <w:rPr>
+          <w:rFonts w:ascii="Consolas" w:eastAsia="Times New Roman" w:hAnsi="Consolas" w:cs="Times New Roman"/>
+          <w:color w:val="FFFFFF"/>
+          <w:kern w:val="0"/>
+          <w:sz w:val="21"/>
+          <w:szCs w:val="21"/>
+          <w:lang w:eastAsia="en-IN"/>
+          <w14:ligatures w14:val="none"/>
+        </w:rPr>
+        <w:t>&gt;</w:t>
+      </w:r>
+    </w:p>
+    <w:p>
+      <w:pPr>
+        <w:pStyle w:val="ListParagraph"/>
+        <w:numPr>
+          <w:ilvl w:val="0"/>
+          <w:numId w:val="2"/>
+        </w:numPr>
+        <w:shd w:val="clear" w:color="auto" w:fill="00002C"/>
+        <w:spacing w:after="0" w:line="285" w:lineRule="atLeast"/>
+        <w:rPr>
+          <w:rFonts w:ascii="Consolas" w:eastAsia="Times New Roman" w:hAnsi="Consolas" w:cs="Times New Roman"/>
+          <w:color w:val="FFFFFF"/>
+          <w:kern w:val="0"/>
+          <w:sz w:val="21"/>
+          <w:szCs w:val="21"/>
+          <w:lang w:eastAsia="en-IN"/>
+          <w14:ligatures w14:val="none"/>
+        </w:rPr>
+      </w:pPr>
+      <w:r>
+        <w:rPr>
+          <w:rFonts w:ascii="Consolas" w:eastAsia="Times New Roman" w:hAnsi="Consolas" w:cs="Times New Roman"/>
+          <w:color w:val="FFFFFF"/>
+          <w:kern w:val="0"/>
+          <w:sz w:val="21"/>
+          <w:szCs w:val="21"/>
+          <w:lang w:eastAsia="en-IN"/>
+          <w14:ligatures w14:val="none"/>
+        </w:rPr>
+        <w:t>        &lt;</w:t>
+      </w:r>
+      <w:r>
+        <w:rPr>
+          <w:rFonts w:ascii="Consolas" w:eastAsia="Times New Roman" w:hAnsi="Consolas" w:cs="Times New Roman"/>
+          <w:color w:val="FF0077"/>
+          <w:kern w:val="0"/>
+          <w:sz w:val="21"/>
+          <w:szCs w:val="21"/>
+          <w:lang w:eastAsia="en-IN"/>
+          <w14:ligatures w14:val="none"/>
+        </w:rPr>
+        <w:t>li</w:t>
+      </w:r>
+      <w:r>
+        <w:rPr>
+          <w:rFonts w:ascii="Consolas" w:eastAsia="Times New Roman" w:hAnsi="Consolas" w:cs="Times New Roman"/>
+          <w:color w:val="FFFFFF"/>
+          <w:kern w:val="0"/>
+          <w:sz w:val="21"/>
+          <w:szCs w:val="21"/>
+          <w:lang w:eastAsia="en-IN"/>
+          <w14:ligatures w14:val="none"/>
+        </w:rPr>
+        <w:t>&gt;selection&lt;/</w:t>
+      </w:r>
+      <w:r>
+        <w:rPr>
+          <w:rFonts w:ascii="Consolas" w:eastAsia="Times New Roman" w:hAnsi="Consolas" w:cs="Times New Roman"/>
+          <w:color w:val="FF0077"/>
+          <w:kern w:val="0"/>
+          <w:sz w:val="21"/>
+          <w:szCs w:val="21"/>
+          <w:lang w:eastAsia="en-IN"/>
+          <w14:ligatures w14:val="none"/>
+        </w:rPr>
+        <w:t>li</w:t>
+      </w:r>
+      <w:r>
+        <w:rPr>
+          <w:rFonts w:ascii="Consolas" w:eastAsia="Times New Roman" w:hAnsi="Consolas" w:cs="Times New Roman"/>
+          <w:color w:val="FFFFFF"/>
+          <w:kern w:val="0"/>
+          <w:sz w:val="21"/>
+          <w:szCs w:val="21"/>
+          <w:lang w:eastAsia="en-IN"/>
+          <w14:ligatures w14:val="none"/>
+        </w:rPr>
+        <w:t>&gt;</w:t>
+      </w:r>
+    </w:p>
+    <w:p>
+      <w:pPr>
+        <w:pStyle w:val="ListParagraph"/>
+        <w:numPr>
+          <w:ilvl w:val="0"/>
+          <w:numId w:val="2"/>
+        </w:numPr>
+        <w:shd w:val="clear" w:color="auto" w:fill="00002C"/>
+        <w:spacing w:after="0" w:line="285" w:lineRule="atLeast"/>
+        <w:rPr>
+          <w:rFonts w:ascii="Consolas" w:eastAsia="Times New Roman" w:hAnsi="Consolas" w:cs="Times New Roman"/>
+          <w:color w:val="FFFFFF"/>
+          <w:kern w:val="0"/>
+          <w:sz w:val="21"/>
+          <w:szCs w:val="21"/>
+          <w:lang w:eastAsia="en-IN"/>
+          <w14:ligatures w14:val="none"/>
+        </w:rPr>
+      </w:pPr>
+      <w:r>
+        <w:rPr>
+          <w:rFonts w:ascii="Consolas" w:eastAsia="Times New Roman" w:hAnsi="Consolas" w:cs="Times New Roman"/>
+          <w:color w:val="FFFFFF"/>
+          <w:kern w:val="0"/>
+          <w:sz w:val="21"/>
+          <w:szCs w:val="21"/>
+          <w:lang w:eastAsia="en-IN"/>
+          <w14:ligatures w14:val="none"/>
+        </w:rPr>
+        <w:t>    &lt;/</w:t>
+      </w:r>
+      <w:proofErr w:type="spellStart"/>
+      <w:r>
+        <w:rPr>
+          <w:rFonts w:ascii="Consolas" w:eastAsia="Times New Roman" w:hAnsi="Consolas" w:cs="Times New Roman"/>
+          <w:color w:val="FF0077"/>
+          <w:kern w:val="0"/>
+          <w:sz w:val="21"/>
+          <w:szCs w:val="21"/>
+          <w:lang w:eastAsia="en-IN"/>
+          <w14:ligatures w14:val="none"/>
+        </w:rPr>
+        <w:t>ol</w:t>
+      </w:r>
+      <w:proofErr w:type="spellEnd"/>
+      <w:r>
+        <w:rPr>
+          <w:rFonts w:ascii="Consolas" w:eastAsia="Times New Roman" w:hAnsi="Consolas" w:cs="Times New Roman"/>
+          <w:color w:val="FFFFFF"/>
+          <w:kern w:val="0"/>
+          <w:sz w:val="21"/>
+          <w:szCs w:val="21"/>
+          <w:lang w:eastAsia="en-IN"/>
+          <w14:ligatures w14:val="none"/>
+        </w:rPr>
+        <w:t>&gt;</w:t>
+      </w:r>
+    </w:p>
+    <w:p>
+      <w:pPr>
+        <w:pStyle w:val="ListParagraph"/>
+        <w:numPr>
+          <w:ilvl w:val="0"/>
+          <w:numId w:val="2"/>
+        </w:numPr>
+        <w:shd w:val="clear" w:color="auto" w:fill="00002C"/>
+        <w:spacing w:after="0" w:line="285" w:lineRule="atLeast"/>
+        <w:rPr>
+          <w:rFonts w:ascii="Consolas" w:eastAsia="Times New Roman" w:hAnsi="Consolas" w:cs="Times New Roman"/>
+          <w:color w:val="FFFFFF"/>
+          <w:kern w:val="0"/>
+          <w:sz w:val="21"/>
+          <w:szCs w:val="21"/>
+          <w:lang w:eastAsia="en-IN"/>
+          <w14:ligatures w14:val="none"/>
+        </w:rPr>
+      </w:pPr>
+      <w:r>
+        <w:rPr>
+          <w:rFonts w:ascii="Consolas" w:eastAsia="Times New Roman" w:hAnsi="Consolas" w:cs="Times New Roman"/>
+          <w:color w:val="FFFFFF"/>
+          <w:kern w:val="0"/>
+          <w:sz w:val="21"/>
+          <w:szCs w:val="21"/>
+          <w:lang w:eastAsia="en-IN"/>
+          <w14:ligatures w14:val="none"/>
+        </w:rPr>
+        <w:t>    &lt;</w:t>
+      </w:r>
+      <w:r>
+        <w:rPr>
+          <w:rFonts w:ascii="Consolas" w:eastAsia="Times New Roman" w:hAnsi="Consolas" w:cs="Times New Roman"/>
+          <w:color w:val="FF0077"/>
+          <w:kern w:val="0"/>
+          <w:sz w:val="21"/>
+          <w:szCs w:val="21"/>
+          <w:lang w:eastAsia="en-IN"/>
+          <w14:ligatures w14:val="none"/>
+        </w:rPr>
+        <w:t>h1</w:t>
+      </w:r>
+      <w:r>
+        <w:rPr>
+          <w:rFonts w:ascii="Consolas" w:eastAsia="Times New Roman" w:hAnsi="Consolas" w:cs="Times New Roman"/>
+          <w:color w:val="FFFFFF"/>
+          <w:kern w:val="0"/>
+          <w:sz w:val="21"/>
+          <w:szCs w:val="21"/>
+          <w:lang w:eastAsia="en-IN"/>
+          <w14:ligatures w14:val="none"/>
+        </w:rPr>
+        <w:t>&gt;Properties:&lt;/</w:t>
+      </w:r>
+      <w:r>
+        <w:rPr>
+          <w:rFonts w:ascii="Consolas" w:eastAsia="Times New Roman" w:hAnsi="Consolas" w:cs="Times New Roman"/>
+          <w:color w:val="FF0077"/>
+          <w:kern w:val="0"/>
+          <w:sz w:val="21"/>
+          <w:szCs w:val="21"/>
+          <w:lang w:eastAsia="en-IN"/>
+          <w14:ligatures w14:val="none"/>
+        </w:rPr>
+        <w:t>h1</w:t>
+      </w:r>
+      <w:r>
+        <w:rPr>
+          <w:rFonts w:ascii="Consolas" w:eastAsia="Times New Roman" w:hAnsi="Consolas" w:cs="Times New Roman"/>
+          <w:color w:val="FFFFFF"/>
+          <w:kern w:val="0"/>
+          <w:sz w:val="21"/>
+          <w:szCs w:val="21"/>
+          <w:lang w:eastAsia="en-IN"/>
+          <w14:ligatures w14:val="none"/>
+        </w:rPr>
+        <w:t>&gt;</w:t>
+      </w:r>
+    </w:p>
+    <w:p>
+      <w:pPr>
+        <w:pStyle w:val="ListParagraph"/>
+        <w:numPr>
+          <w:ilvl w:val="0"/>
+          <w:numId w:val="2"/>
+        </w:numPr>
+        <w:shd w:val="clear" w:color="auto" w:fill="00002C"/>
+        <w:spacing w:after="0" w:line="285" w:lineRule="atLeast"/>
+        <w:rPr>
+          <w:rFonts w:ascii="Consolas" w:eastAsia="Times New Roman" w:hAnsi="Consolas" w:cs="Times New Roman"/>
+          <w:color w:val="FFFFFF"/>
+          <w:kern w:val="0"/>
+          <w:sz w:val="21"/>
+          <w:szCs w:val="21"/>
+          <w:lang w:eastAsia="en-IN"/>
+          <w14:ligatures w14:val="none"/>
+        </w:rPr>
+      </w:pPr>
+      <w:r>
+        <w:rPr>
+          <w:rFonts w:ascii="Consolas" w:eastAsia="Times New Roman" w:hAnsi="Consolas" w:cs="Times New Roman"/>
+          <w:color w:val="FFFFFF"/>
+          <w:kern w:val="0"/>
+          <w:sz w:val="21"/>
+          <w:szCs w:val="21"/>
+          <w:lang w:eastAsia="en-IN"/>
+          <w14:ligatures w14:val="none"/>
+        </w:rPr>
+        <w:t>    &lt;</w:t>
+      </w:r>
+      <w:r>
+        <w:rPr>
+          <w:rFonts w:ascii="Consolas" w:eastAsia="Times New Roman" w:hAnsi="Consolas" w:cs="Times New Roman"/>
+          <w:color w:val="FF0077"/>
+          <w:kern w:val="0"/>
+          <w:sz w:val="21"/>
+          <w:szCs w:val="21"/>
+          <w:lang w:eastAsia="en-IN"/>
+          <w14:ligatures w14:val="none"/>
+        </w:rPr>
+        <w:t>pre</w:t>
+      </w:r>
+      <w:r>
+        <w:rPr>
+          <w:rFonts w:ascii="Consolas" w:eastAsia="Times New Roman" w:hAnsi="Consolas" w:cs="Times New Roman"/>
+          <w:color w:val="FFFFFF"/>
+          <w:kern w:val="0"/>
+          <w:sz w:val="21"/>
+          <w:szCs w:val="21"/>
+          <w:lang w:eastAsia="en-IN"/>
+          <w14:ligatures w14:val="none"/>
+        </w:rPr>
+        <w:t>&gt;</w:t>
+      </w:r>
+    </w:p>
+    <w:p>
+      <w:pPr>
+        <w:pStyle w:val="ListParagraph"/>
+        <w:numPr>
+          <w:ilvl w:val="0"/>
+          <w:numId w:val="2"/>
+        </w:numPr>
+        <w:shd w:val="clear" w:color="auto" w:fill="00002C"/>
+        <w:spacing w:after="0" w:line="285" w:lineRule="atLeast"/>
+        <w:rPr>
+          <w:rFonts w:ascii="Consolas" w:eastAsia="Times New Roman" w:hAnsi="Consolas" w:cs="Times New Roman"/>
+          <w:color w:val="FFFFFF"/>
+          <w:kern w:val="0"/>
+          <w:sz w:val="21"/>
+          <w:szCs w:val="21"/>
+          <w:lang w:eastAsia="en-IN"/>
+          <w14:ligatures w14:val="none"/>
+        </w:rPr>
+      </w:pPr>
+      <w:r>
+        <w:rPr>
+          <w:rFonts w:ascii="Consolas" w:eastAsia="Times New Roman" w:hAnsi="Consolas" w:cs="Times New Roman"/>
+          <w:color w:val="FFFFFF"/>
+          <w:kern w:val="0"/>
+          <w:sz w:val="21"/>
+          <w:szCs w:val="21"/>
+          <w:lang w:eastAsia="en-IN"/>
+          <w14:ligatures w14:val="none"/>
+        </w:rPr>
+        <w:t xml:space="preserve">        A CSS property is the specific style feature of an element that you want to </w:t>
+      </w:r>
+      <w:proofErr w:type="gramStart"/>
+      <w:r>
+        <w:rPr>
+          <w:rFonts w:ascii="Consolas" w:eastAsia="Times New Roman" w:hAnsi="Consolas" w:cs="Times New Roman"/>
+          <w:color w:val="FFFFFF"/>
+          <w:kern w:val="0"/>
+          <w:sz w:val="21"/>
+          <w:szCs w:val="21"/>
+          <w:lang w:eastAsia="en-IN"/>
+          <w14:ligatures w14:val="none"/>
+        </w:rPr>
+        <w:t>change(</w:t>
+      </w:r>
+      <w:proofErr w:type="gramEnd"/>
+      <w:r>
+        <w:rPr>
+          <w:rFonts w:ascii="Consolas" w:eastAsia="Times New Roman" w:hAnsi="Consolas" w:cs="Times New Roman"/>
+          <w:color w:val="FFFFFF"/>
+          <w:kern w:val="0"/>
+          <w:sz w:val="21"/>
+          <w:szCs w:val="21"/>
+          <w:lang w:eastAsia="en-IN"/>
+          <w14:ligatures w14:val="none"/>
+        </w:rPr>
+        <w:t xml:space="preserve">e.g. width, </w:t>
+      </w:r>
+      <w:proofErr w:type="spellStart"/>
+      <w:r>
+        <w:rPr>
+          <w:rFonts w:ascii="Consolas" w:eastAsia="Times New Roman" w:hAnsi="Consolas" w:cs="Times New Roman"/>
+          <w:color w:val="FFFFFF"/>
+          <w:kern w:val="0"/>
+          <w:sz w:val="21"/>
+          <w:szCs w:val="21"/>
+          <w:lang w:eastAsia="en-IN"/>
+          <w14:ligatures w14:val="none"/>
+        </w:rPr>
+        <w:t>color</w:t>
+      </w:r>
+      <w:proofErr w:type="spellEnd"/>
+      <w:r>
+        <w:rPr>
+          <w:rFonts w:ascii="Consolas" w:eastAsia="Times New Roman" w:hAnsi="Consolas" w:cs="Times New Roman"/>
+          <w:color w:val="FFFFFF"/>
+          <w:kern w:val="0"/>
+          <w:sz w:val="21"/>
+          <w:szCs w:val="21"/>
+          <w:lang w:eastAsia="en-IN"/>
+          <w14:ligatures w14:val="none"/>
+        </w:rPr>
+        <w:t>, etc)</w:t>
+      </w:r>
+    </w:p>
+    <w:p>
+      <w:pPr>
+        <w:pStyle w:val="ListParagraph"/>
+        <w:numPr>
+          <w:ilvl w:val="0"/>
+          <w:numId w:val="2"/>
+        </w:numPr>
+        <w:shd w:val="clear" w:color="auto" w:fill="00002C"/>
+        <w:spacing w:after="0" w:line="285" w:lineRule="atLeast"/>
+        <w:rPr>
+          <w:rFonts w:ascii="Consolas" w:eastAsia="Times New Roman" w:hAnsi="Consolas" w:cs="Times New Roman"/>
+          <w:color w:val="FFFFFF"/>
+          <w:kern w:val="0"/>
+          <w:sz w:val="21"/>
+          <w:szCs w:val="21"/>
+          <w:lang w:eastAsia="en-IN"/>
+          <w14:ligatures w14:val="none"/>
+        </w:rPr>
+      </w:pPr>
+      <w:r>
+        <w:rPr>
+          <w:rFonts w:ascii="Consolas" w:eastAsia="Times New Roman" w:hAnsi="Consolas" w:cs="Times New Roman"/>
+          <w:color w:val="FFFFFF"/>
+          <w:kern w:val="0"/>
+          <w:sz w:val="21"/>
+          <w:szCs w:val="21"/>
+          <w:lang w:eastAsia="en-IN"/>
+          <w14:ligatures w14:val="none"/>
+        </w:rPr>
+        <w:t>        every Property is paired with a value using a colon (:)</w:t>
+      </w:r>
+    </w:p>
+    <w:p>
+      <w:pPr>
+        <w:pStyle w:val="ListParagraph"/>
+        <w:numPr>
+          <w:ilvl w:val="0"/>
+          <w:numId w:val="2"/>
+        </w:numPr>
+        <w:shd w:val="clear" w:color="auto" w:fill="00002C"/>
+        <w:spacing w:after="0" w:line="285" w:lineRule="atLeast"/>
+        <w:rPr>
+          <w:rFonts w:ascii="Consolas" w:eastAsia="Times New Roman" w:hAnsi="Consolas" w:cs="Times New Roman"/>
+          <w:color w:val="FFFFFF"/>
+          <w:kern w:val="0"/>
+          <w:sz w:val="21"/>
+          <w:szCs w:val="21"/>
+          <w:lang w:eastAsia="en-IN"/>
+          <w14:ligatures w14:val="none"/>
+        </w:rPr>
+      </w:pPr>
+      <w:r>
+        <w:rPr>
+          <w:rFonts w:ascii="Consolas" w:eastAsia="Times New Roman" w:hAnsi="Consolas" w:cs="Times New Roman"/>
+          <w:color w:val="FFFFFF"/>
+          <w:kern w:val="0"/>
+          <w:sz w:val="21"/>
+          <w:szCs w:val="21"/>
+          <w:lang w:eastAsia="en-IN"/>
+          <w14:ligatures w14:val="none"/>
+        </w:rPr>
+        <w:t>    &lt;/</w:t>
+      </w:r>
+      <w:r>
+        <w:rPr>
+          <w:rFonts w:ascii="Consolas" w:eastAsia="Times New Roman" w:hAnsi="Consolas" w:cs="Times New Roman"/>
+          <w:color w:val="FF0077"/>
+          <w:kern w:val="0"/>
+          <w:sz w:val="21"/>
+          <w:szCs w:val="21"/>
+          <w:lang w:eastAsia="en-IN"/>
+          <w14:ligatures w14:val="none"/>
+        </w:rPr>
+        <w:t>pre</w:t>
+      </w:r>
+      <w:r>
+        <w:rPr>
+          <w:rFonts w:ascii="Consolas" w:eastAsia="Times New Roman" w:hAnsi="Consolas" w:cs="Times New Roman"/>
+          <w:color w:val="FFFFFF"/>
+          <w:kern w:val="0"/>
+          <w:sz w:val="21"/>
+          <w:szCs w:val="21"/>
+          <w:lang w:eastAsia="en-IN"/>
+          <w14:ligatures w14:val="none"/>
+        </w:rPr>
+        <w:t>&gt;</w:t>
+      </w:r>
+    </w:p>
+    <w:p>
+      <w:pPr>
+        <w:rPr>
+          <w:sz w:val="28"/>
+          <w:szCs w:val="28"/>
+        </w:rPr>
+      </w:pPr>
+    </w:p>
+    <w:tbl>
+      <w:tblPr>
+        <w:tblStyle w:val="TableGrid"/>
+        <w:tblW w:w="0" w:type="auto"/>
+        <w:tblLook w:val="04A0" w:firstRow="1" w:lastRow="0" w:firstColumn="1" w:lastColumn="0" w:noHBand="0" w:noVBand="1"/>
+      </w:tblPr>
+      <w:tblGrid>
+        <w:gridCol w:w="2122"/>
+        <w:gridCol w:w="8237"/>
+      </w:tblGrid>
+      <w:tr>
+        <w:trPr>
+          <w:trHeight w:val="422"/>
+        </w:trPr>
+        <w:tc>
+          <w:tcPr>
+            <w:tcW w:w="2122" w:type="dxa"/>
+          </w:tcPr>
+          <w:p>
+            <w:pPr>
+              <w:rPr>
+                <w:sz w:val="28"/>
+                <w:szCs w:val="28"/>
+              </w:rPr>
+            </w:pPr>
+            <w:r>
+              <w:rPr>
+                <w:sz w:val="28"/>
+                <w:szCs w:val="28"/>
+              </w:rPr>
+              <w:t>Group</w:t>
+            </w:r>
+          </w:p>
+        </w:tc>
+        <w:tc>
+          <w:tcPr>
+            <w:tcW w:w="8237" w:type="dxa"/>
+          </w:tcPr>
+          <w:p>
+            <w:pPr>
+              <w:rPr>
+                <w:sz w:val="28"/>
+                <w:szCs w:val="28"/>
+              </w:rPr>
+            </w:pPr>
+            <w:r>
+              <w:rPr>
+                <w:sz w:val="28"/>
+                <w:szCs w:val="28"/>
+              </w:rPr>
+              <w:t xml:space="preserve">Property </w:t>
+            </w:r>
+          </w:p>
+        </w:tc>
+      </w:tr>
+      <w:tr>
+        <w:trPr>
+          <w:trHeight w:val="437"/>
+        </w:trPr>
+        <w:tc>
+          <w:tcPr>
+            <w:tcW w:w="2122" w:type="dxa"/>
+          </w:tcPr>
+          <w:p>
+            <w:pPr>
+              <w:rPr>
+                <w:sz w:val="28"/>
+                <w:szCs w:val="28"/>
+              </w:rPr>
+            </w:pPr>
+            <w:r>
+              <w:rPr>
+                <w:sz w:val="28"/>
+                <w:szCs w:val="28"/>
+              </w:rPr>
+              <w:t>Text, font</w:t>
+            </w:r>
+          </w:p>
+        </w:tc>
+        <w:tc>
+          <w:tcPr>
+            <w:tcW w:w="8237" w:type="dxa"/>
+          </w:tcPr>
+          <w:p>
+            <w:pPr>
+              <w:rPr>
+                <w:sz w:val="28"/>
+                <w:szCs w:val="28"/>
+              </w:rPr>
+            </w:pPr>
+            <w:r>
+              <w:rPr>
+                <w:sz w:val="28"/>
+                <w:szCs w:val="28"/>
+              </w:rPr>
+              <w:t>Colour, family, font size, Text align</w:t>
+            </w:r>
+          </w:p>
+        </w:tc>
+      </w:tr>
+      <w:tr>
+        <w:trPr>
+          <w:trHeight w:val="422"/>
+        </w:trPr>
+        <w:tc>
+          <w:tcPr>
+            <w:tcW w:w="2122" w:type="dxa"/>
+          </w:tcPr>
+          <w:p>
+            <w:pPr>
+              <w:rPr>
+                <w:sz w:val="28"/>
+                <w:szCs w:val="28"/>
+              </w:rPr>
+            </w:pPr>
+            <w:r>
+              <w:rPr>
+                <w:sz w:val="28"/>
+                <w:szCs w:val="28"/>
+              </w:rPr>
+              <w:t>Box model</w:t>
+            </w:r>
+          </w:p>
+        </w:tc>
+        <w:tc>
+          <w:tcPr>
+            <w:tcW w:w="8237" w:type="dxa"/>
+          </w:tcPr>
+          <w:p>
+            <w:pPr>
+              <w:rPr>
+                <w:sz w:val="28"/>
+                <w:szCs w:val="28"/>
+              </w:rPr>
+            </w:pPr>
+            <w:r>
+              <w:rPr>
+                <w:sz w:val="28"/>
+                <w:szCs w:val="28"/>
+              </w:rPr>
+              <w:t xml:space="preserve">Width, height, margin, padding, </w:t>
+            </w:r>
+            <w:proofErr w:type="spellStart"/>
+            <w:r>
+              <w:rPr>
+                <w:sz w:val="28"/>
+                <w:szCs w:val="28"/>
+              </w:rPr>
+              <w:t>bodder</w:t>
+            </w:r>
+            <w:proofErr w:type="spellEnd"/>
+            <w:r>
+              <w:rPr>
+                <w:sz w:val="28"/>
+                <w:szCs w:val="28"/>
+              </w:rPr>
+              <w:t xml:space="preserve"> and box sizing</w:t>
+            </w:r>
+          </w:p>
+        </w:tc>
+      </w:tr>
+      <w:tr>
+        <w:trPr>
+          <w:trHeight w:val="550"/>
+        </w:trPr>
+        <w:tc>
+          <w:tcPr>
+            <w:tcW w:w="2122" w:type="dxa"/>
+          </w:tcPr>
+          <w:p>
+            <w:pPr>
+              <w:rPr>
+                <w:sz w:val="28"/>
+                <w:szCs w:val="28"/>
+              </w:rPr>
+            </w:pPr>
+            <w:r>
+              <w:rPr>
+                <w:sz w:val="28"/>
+                <w:szCs w:val="28"/>
+              </w:rPr>
+              <w:t xml:space="preserve">Background </w:t>
+            </w:r>
+          </w:p>
+        </w:tc>
+        <w:tc>
+          <w:tcPr>
+            <w:tcW w:w="8237" w:type="dxa"/>
+          </w:tcPr>
+          <w:p>
+            <w:pPr>
+              <w:rPr>
+                <w:sz w:val="28"/>
+                <w:szCs w:val="28"/>
+              </w:rPr>
+            </w:pPr>
+            <w:r>
+              <w:rPr>
+                <w:sz w:val="28"/>
+                <w:szCs w:val="28"/>
+              </w:rPr>
+              <w:t>Background-</w:t>
+            </w:r>
+            <w:proofErr w:type="spellStart"/>
+            <w:r>
+              <w:rPr>
+                <w:sz w:val="28"/>
+                <w:szCs w:val="28"/>
+              </w:rPr>
+              <w:t>color</w:t>
+            </w:r>
+            <w:proofErr w:type="spellEnd"/>
+            <w:r>
+              <w:rPr>
+                <w:sz w:val="28"/>
+                <w:szCs w:val="28"/>
+              </w:rPr>
+              <w:t xml:space="preserve">, </w:t>
+            </w:r>
+            <w:proofErr w:type="spellStart"/>
+            <w:r>
+              <w:rPr>
+                <w:sz w:val="28"/>
+                <w:szCs w:val="28"/>
+              </w:rPr>
+              <w:t>bg-img</w:t>
+            </w:r>
+            <w:proofErr w:type="spellEnd"/>
+            <w:r>
+              <w:rPr>
+                <w:sz w:val="28"/>
+                <w:szCs w:val="28"/>
+              </w:rPr>
+              <w:t xml:space="preserve">, </w:t>
+            </w:r>
+            <w:proofErr w:type="spellStart"/>
+            <w:r>
+              <w:rPr>
+                <w:sz w:val="28"/>
+                <w:szCs w:val="28"/>
+              </w:rPr>
+              <w:t>bg</w:t>
+            </w:r>
+            <w:proofErr w:type="spellEnd"/>
+            <w:r>
+              <w:rPr>
+                <w:sz w:val="28"/>
+                <w:szCs w:val="28"/>
+              </w:rPr>
+              <w:t>-size</w:t>
+            </w:r>
+          </w:p>
+        </w:tc>
+      </w:tr>
+      <w:tr>
+        <w:trPr>
+          <w:trHeight w:val="550"/>
+        </w:trPr>
+        <w:tc>
+          <w:tcPr>
+            <w:tcW w:w="2122" w:type="dxa"/>
+          </w:tcPr>
+          <w:p>
+            <w:pPr>
+              <w:rPr>
+                <w:sz w:val="28"/>
+                <w:szCs w:val="28"/>
+              </w:rPr>
+            </w:pPr>
+            <w:r>
+              <w:rPr>
+                <w:sz w:val="28"/>
+                <w:szCs w:val="28"/>
+              </w:rPr>
+              <w:t>layout</w:t>
+            </w:r>
+          </w:p>
+        </w:tc>
+        <w:tc>
+          <w:tcPr>
+            <w:tcW w:w="8237" w:type="dxa"/>
+          </w:tcPr>
+          <w:p>
+            <w:pPr>
+              <w:rPr>
+                <w:sz w:val="28"/>
+                <w:szCs w:val="28"/>
+              </w:rPr>
+            </w:pPr>
+            <w:r>
+              <w:rPr>
+                <w:sz w:val="28"/>
+                <w:szCs w:val="28"/>
+              </w:rPr>
+              <w:t>Display-</w:t>
+            </w:r>
+            <w:proofErr w:type="spellStart"/>
+            <w:proofErr w:type="gramStart"/>
+            <w:r>
+              <w:rPr>
+                <w:sz w:val="28"/>
+                <w:szCs w:val="28"/>
+              </w:rPr>
+              <w:t>position,float</w:t>
+            </w:r>
+            <w:proofErr w:type="spellEnd"/>
+            <w:proofErr w:type="gramEnd"/>
+            <w:r>
+              <w:rPr>
+                <w:sz w:val="28"/>
+                <w:szCs w:val="28"/>
+              </w:rPr>
+              <w:t xml:space="preserve">, </w:t>
+            </w:r>
+            <w:proofErr w:type="spellStart"/>
+            <w:proofErr w:type="gramStart"/>
+            <w:r>
+              <w:rPr>
+                <w:sz w:val="28"/>
+                <w:szCs w:val="28"/>
+              </w:rPr>
+              <w:t>flex,grid</w:t>
+            </w:r>
+            <w:proofErr w:type="gramEnd"/>
+            <w:r>
+              <w:rPr>
+                <w:sz w:val="28"/>
+                <w:szCs w:val="28"/>
+              </w:rPr>
+              <w:t>,z</w:t>
+            </w:r>
+            <w:proofErr w:type="spellEnd"/>
+            <w:r>
+              <w:rPr>
+                <w:sz w:val="28"/>
+                <w:szCs w:val="28"/>
+              </w:rPr>
+              <w:t>-index</w:t>
+            </w:r>
+          </w:p>
+        </w:tc>
+      </w:tr>
+      <w:tr>
+        <w:trPr>
+          <w:trHeight w:val="550"/>
+        </w:trPr>
+        <w:tc>
+          <w:tcPr>
+            <w:tcW w:w="2122" w:type="dxa"/>
+          </w:tcPr>
+          <w:p>
+            <w:pPr>
+              <w:rPr>
+                <w:sz w:val="24"/>
+                <w:szCs w:val="24"/>
+              </w:rPr>
+            </w:pPr>
+            <w:r>
+              <w:rPr>
+                <w:sz w:val="24"/>
+                <w:szCs w:val="24"/>
+              </w:rPr>
+              <w:t xml:space="preserve">Effects: </w:t>
+            </w:r>
+          </w:p>
+        </w:tc>
+        <w:tc>
+          <w:tcPr>
+            <w:tcW w:w="8237" w:type="dxa"/>
+          </w:tcPr>
+          <w:p>
+            <w:pPr>
+              <w:rPr>
+                <w:sz w:val="28"/>
+                <w:szCs w:val="28"/>
+              </w:rPr>
+            </w:pPr>
+            <w:r>
+              <w:rPr>
+                <w:sz w:val="24"/>
+                <w:szCs w:val="24"/>
+              </w:rPr>
+              <w:t xml:space="preserve">Box-shadow, </w:t>
+            </w:r>
+            <w:proofErr w:type="spellStart"/>
+            <w:proofErr w:type="gramStart"/>
+            <w:r>
+              <w:rPr>
+                <w:sz w:val="24"/>
+                <w:szCs w:val="24"/>
+              </w:rPr>
+              <w:t>Opacity</w:t>
+            </w:r>
+            <w:r>
+              <w:rPr>
+                <w:sz w:val="24"/>
+                <w:szCs w:val="24"/>
+              </w:rPr>
+              <w:t>,transform</w:t>
+            </w:r>
+            <w:proofErr w:type="gramEnd"/>
+            <w:r>
+              <w:rPr>
+                <w:sz w:val="24"/>
+                <w:szCs w:val="24"/>
+              </w:rPr>
+              <w:t>,</w:t>
+            </w:r>
+            <w:proofErr w:type="gramStart"/>
+            <w:r>
+              <w:rPr>
+                <w:sz w:val="24"/>
+                <w:szCs w:val="24"/>
+              </w:rPr>
+              <w:t>transition,filter</w:t>
+            </w:r>
+            <w:proofErr w:type="spellEnd"/>
+            <w:proofErr w:type="gramEnd"/>
+          </w:p>
+        </w:tc>
+      </w:tr>
+      <w:tr>
+        <w:trPr>
+          <w:trHeight w:val="550"/>
+        </w:trPr>
+        <w:tc>
+          <w:tcPr>
+            <w:tcW w:w="2122" w:type="dxa"/>
+          </w:tcPr>
+          <w:p>
+            <w:pPr>
+              <w:rPr>
+                <w:sz w:val="28"/>
+                <w:szCs w:val="28"/>
+              </w:rPr>
+            </w:pPr>
+            <w:r>
+              <w:rPr>
+                <w:sz w:val="28"/>
+                <w:szCs w:val="28"/>
+              </w:rPr>
+              <w:t xml:space="preserve">Animation </w:t>
+            </w:r>
+          </w:p>
+        </w:tc>
+        <w:tc>
+          <w:tcPr>
+            <w:tcW w:w="8237" w:type="dxa"/>
+          </w:tcPr>
+          <w:p>
+            <w:pPr>
+              <w:rPr>
+                <w:sz w:val="28"/>
+                <w:szCs w:val="28"/>
+              </w:rPr>
+            </w:pPr>
+            <w:r>
+              <w:rPr>
+                <w:sz w:val="28"/>
+                <w:szCs w:val="28"/>
+              </w:rPr>
+              <w:t>Animation, @keyframe,</w:t>
+            </w:r>
+          </w:p>
+        </w:tc>
+      </w:tr>
+      <w:tr>
+        <w:trPr>
+          <w:trHeight w:val="550"/>
+        </w:trPr>
+        <w:tc>
+          <w:tcPr>
+            <w:tcW w:w="2122" w:type="dxa"/>
+          </w:tcPr>
+          <w:p>
+            <w:pPr>
+              <w:rPr>
+                <w:sz w:val="28"/>
+                <w:szCs w:val="28"/>
+              </w:rPr>
+            </w:pPr>
+            <w:r>
+              <w:rPr>
+                <w:sz w:val="28"/>
+                <w:szCs w:val="28"/>
+              </w:rPr>
+              <w:t>List/Table</w:t>
+            </w:r>
+          </w:p>
+        </w:tc>
+        <w:tc>
+          <w:tcPr>
+            <w:tcW w:w="8237" w:type="dxa"/>
+          </w:tcPr>
+          <w:p>
+            <w:pPr>
+              <w:rPr>
+                <w:sz w:val="28"/>
+                <w:szCs w:val="28"/>
+              </w:rPr>
+            </w:pPr>
+            <w:r>
+              <w:rPr>
+                <w:sz w:val="28"/>
+                <w:szCs w:val="28"/>
+              </w:rPr>
+              <w:t>List-style, caption-size</w:t>
+            </w:r>
+          </w:p>
+        </w:tc>
+      </w:tr>
+      <w:tr>
+        <w:trPr>
+          <w:trHeight w:val="550"/>
+        </w:trPr>
+        <w:tc>
+          <w:tcPr>
+            <w:tcW w:w="2122" w:type="dxa"/>
+          </w:tcPr>
+          <w:p>
+            <w:pPr>
+              <w:rPr>
+                <w:sz w:val="28"/>
+                <w:szCs w:val="28"/>
+              </w:rPr>
+            </w:pPr>
+            <w:proofErr w:type="gramStart"/>
+            <w:r>
+              <w:rPr>
+                <w:sz w:val="28"/>
+                <w:szCs w:val="28"/>
+              </w:rPr>
+              <w:t>!important</w:t>
+            </w:r>
+            <w:proofErr w:type="gramEnd"/>
+            <w:r>
+              <w:rPr>
+                <w:sz w:val="28"/>
+                <w:szCs w:val="28"/>
+              </w:rPr>
+              <w:t xml:space="preserve"> </w:t>
+            </w:r>
+          </w:p>
+        </w:tc>
+        <w:tc>
+          <w:tcPr>
+            <w:tcW w:w="8237" w:type="dxa"/>
+          </w:tcPr>
+          <w:p>
+            <w:pPr>
+              <w:rPr>
+                <w:sz w:val="28"/>
+                <w:szCs w:val="28"/>
+              </w:rPr>
+            </w:pPr>
+            <w:r>
+              <w:rPr>
+                <w:sz w:val="28"/>
+                <w:szCs w:val="28"/>
+              </w:rPr>
+              <w:t xml:space="preserve">To mark something important </w:t>
+            </w:r>
+          </w:p>
+        </w:tc>
+      </w:tr>
+    </w:tbl>
     <w:p>
       <w:pPr>
         <w:rPr>
@@ -353,6 +3563,95 @@
 <file path=word/numbering.xml><?xml version="1.0" encoding="utf-8"?>
 <w:numbering xmlns:wpc="http://schemas.microsoft.com/office/word/2010/wordprocessingCanvas" xmlns:cx="http://schemas.microsoft.com/office/drawing/2014/chartex" xmlns:cx1="http://schemas.microsoft.com/office/drawing/2015/9/8/chartex" xmlns:cx2="http://schemas.microsoft.com/office/drawing/2015/10/21/chartex" xmlns:cx3="http://schemas.microsoft.com/office/drawing/2016/5/9/chartex" xmlns:cx4="http://schemas.microsoft.com/office/drawing/2016/5/10/chartex" xmlns:cx5="http://schemas.microsoft.com/office/drawing/2016/5/11/chartex" xmlns:cx6="http://schemas.microsoft.com/office/drawing/2016/5/12/chartex" xmlns:cx7="http://schemas.microsoft.com/office/drawing/2016/5/13/chartex" xmlns:cx8="http://schemas.microsoft.com/office/drawing/2016/5/14/chartex" xmlns:mc="http://schemas.openxmlformats.org/markup-compatibility/2006" xmlns:aink="http://schemas.microsoft.com/office/drawing/2016/ink" xmlns:am3d="http://schemas.microsoft.com/office/drawing/2017/model3d" xmlns:o="urn:schemas-microsoft-com:office:office" xmlns:oel="http://schemas.microsoft.com/office/2019/extlst" xmlns:r="http://schemas.openxmlformats.org/officeDocument/2006/relationships" xmlns:m="http://schemas.openxmlformats.org/officeDocument/2006/math" xmlns:v="urn:schemas-microsoft-com:vml" xmlns:wp14="http://schemas.microsoft.com/office/word/2010/wordprocessingDrawing" xmlns:wp="http://schemas.openxmlformats.org/drawingml/2006/wordprocessingDrawing" xmlns:w10="urn:schemas-microsoft-com:office:word" xmlns:w="http://schemas.openxmlformats.org/wordprocessingml/2006/main" xmlns:w14="http://schemas.microsoft.com/office/word/2010/wordml" xmlns:w15="http://schemas.microsoft.com/office/word/2012/wordml" xmlns:w16cex="http://schemas.microsoft.com/office/word/2018/wordml/cex" xmlns:w16cid="http://schemas.microsoft.com/office/word/2016/wordml/cid" xmlns:w16="http://schemas.microsoft.com/office/word/2018/wordml" xmlns:w16du="http://schemas.microsoft.com/office/word/2023/wordml/word16du" xmlns:w16sdtdh="http://schemas.microsoft.com/office/word/2020/wordml/sdtdatahash" xmlns:w16sdtfl="http://schemas.microsoft.com/office/word/2024/wordml/sdtformatlock" xmlns:w16se="http://schemas.microsoft.com/office/word/2015/wordml/symex" xmlns:wpg="http://schemas.microsoft.com/office/word/2010/wordprocessingGroup" xmlns:wpi="http://schemas.microsoft.com/office/word/2010/wordprocessingInk" xmlns:wne="http://schemas.microsoft.com/office/word/2006/wordml" xmlns:wps="http://schemas.microsoft.com/office/word/2010/wordprocessingShape" mc:Ignorable="w14 w15 w16se w16cid w16 w16cex w16sdtdh w16sdtfl w16du wp14">
   <w:abstractNum w:abstractNumId="0" w15:restartNumberingAfterBreak="0">
+    <w:nsid w:val="41701ADF"/>
+    <w:multiLevelType w:val="hybridMultilevel"/>
+    <w:tmpl w:val="E7321BF8"/>
+    <w:lvl w:ilvl="0" w:tplc="4009000F">
+      <w:start w:val="1"/>
+      <w:numFmt w:val="decimal"/>
+      <w:lvlText w:val="%1."/>
+      <w:lvlJc w:val="left"/>
+      <w:pPr>
+        <w:ind w:left="720" w:hanging="360"/>
+      </w:pPr>
+      <w:rPr>
+        <w:rFonts w:hint="default"/>
+      </w:rPr>
+    </w:lvl>
+    <w:lvl w:ilvl="1" w:tplc="40090019">
+      <w:start w:val="1"/>
+      <w:numFmt w:val="lowerLetter"/>
+      <w:lvlText w:val="%2."/>
+      <w:lvlJc w:val="left"/>
+      <w:pPr>
+        <w:ind w:left="1440" w:hanging="360"/>
+      </w:pPr>
+    </w:lvl>
+    <w:lvl w:ilvl="2" w:tplc="4009001B" w:tentative="1">
+      <w:start w:val="1"/>
+      <w:numFmt w:val="lowerRoman"/>
+      <w:lvlText w:val="%3."/>
+      <w:lvlJc w:val="right"/>
+      <w:pPr>
+        <w:ind w:left="2160" w:hanging="180"/>
+      </w:pPr>
+    </w:lvl>
+    <w:lvl w:ilvl="3" w:tplc="4009000F" w:tentative="1">
+      <w:start w:val="1"/>
+      <w:numFmt w:val="decimal"/>
+      <w:lvlText w:val="%4."/>
+      <w:lvlJc w:val="left"/>
+      <w:pPr>
+        <w:ind w:left="2880" w:hanging="360"/>
+      </w:pPr>
+    </w:lvl>
+    <w:lvl w:ilvl="4" w:tplc="40090019" w:tentative="1">
+      <w:start w:val="1"/>
+      <w:numFmt w:val="lowerLetter"/>
+      <w:lvlText w:val="%5."/>
+      <w:lvlJc w:val="left"/>
+      <w:pPr>
+        <w:ind w:left="3600" w:hanging="360"/>
+      </w:pPr>
+    </w:lvl>
+    <w:lvl w:ilvl="5" w:tplc="4009001B" w:tentative="1">
+      <w:start w:val="1"/>
+      <w:numFmt w:val="lowerRoman"/>
+      <w:lvlText w:val="%6."/>
+      <w:lvlJc w:val="right"/>
+      <w:pPr>
+        <w:ind w:left="4320" w:hanging="180"/>
+      </w:pPr>
+    </w:lvl>
+    <w:lvl w:ilvl="6" w:tplc="4009000F" w:tentative="1">
+      <w:start w:val="1"/>
+      <w:numFmt w:val="decimal"/>
+      <w:lvlText w:val="%7."/>
+      <w:lvlJc w:val="left"/>
+      <w:pPr>
+        <w:ind w:left="5040" w:hanging="360"/>
+      </w:pPr>
+    </w:lvl>
+    <w:lvl w:ilvl="7" w:tplc="40090019" w:tentative="1">
+      <w:start w:val="1"/>
+      <w:numFmt w:val="lowerLetter"/>
+      <w:lvlText w:val="%8."/>
+      <w:lvlJc w:val="left"/>
+      <w:pPr>
+        <w:ind w:left="5760" w:hanging="360"/>
+      </w:pPr>
+    </w:lvl>
+    <w:lvl w:ilvl="8" w:tplc="4009001B" w:tentative="1">
+      <w:start w:val="1"/>
+      <w:numFmt w:val="lowerRoman"/>
+      <w:lvlText w:val="%9."/>
+      <w:lvlJc w:val="right"/>
+      <w:pPr>
+        <w:ind w:left="6480" w:hanging="180"/>
+      </w:pPr>
+    </w:lvl>
+  </w:abstractNum>
+  <w:abstractNum w:abstractNumId="1" w15:restartNumberingAfterBreak="0">
     <w:nsid w:val="42462B3A"/>
     <w:multiLevelType w:val="hybridMultilevel"/>
     <w:tmpl w:val="52A27B4E"/>
@@ -442,6 +3741,9 @@
     </w:lvl>
   </w:abstractNum>
   <w:num w:numId="1" w16cid:durableId="1463882300">
+    <w:abstractNumId w:val="1"/>
+  </w:num>
+  <w:num w:numId="2" w16cid:durableId="956720097">
     <w:abstractNumId w:val="0"/>
   </w:num>
 </w:numbering>
@@ -1365,6 +4667,25 @@
       <w:spacing w:val="5"/>
     </w:rPr>
   </w:style>
+  <w:style w:type="table" w:styleId="TableGrid">
+    <w:name w:val="Table Grid"/>
+    <w:basedOn w:val="TableNormal"/>
+    <w:uiPriority w:val="39"/>
+    <w:rsid w:val="00B51E15"/>
+    <w:pPr>
+      <w:spacing w:after="0" w:line="240" w:lineRule="auto"/>
+    </w:pPr>
+    <w:tblPr>
+      <w:tblBorders>
+        <w:top w:val="single" w:sz="4" w:space="0" w:color="auto"/>
+        <w:left w:val="single" w:sz="4" w:space="0" w:color="auto"/>
+        <w:bottom w:val="single" w:sz="4" w:space="0" w:color="auto"/>
+        <w:right w:val="single" w:sz="4" w:space="0" w:color="auto"/>
+        <w:insideH w:val="single" w:sz="4" w:space="0" w:color="auto"/>
+        <w:insideV w:val="single" w:sz="4" w:space="0" w:color="auto"/>
+      </w:tblBorders>
+    </w:tblPr>
+  </w:style>
 </w:styles>
 </file>
 

</xml_diff>